<commit_message>
docs: regenerate the PDF and Word of the updated documents
</commit_message>
<xml_diff>
--- a/07_PROCEDIMIENTO_DE_IMPLEMENTACION/EN/WORD/07_Deployment_Document.docx
+++ b/07_PROCEDIMIENTO_DE_IMPLEMENTACION/EN/WORD/07_Deployment_Document.docx
@@ -2,7 +2,7 @@
 <file path=word/document.xml><?xml version="1.0" encoding="utf-8"?>
 <w:document xmlns:w="http://schemas.openxmlformats.org/wordprocessingml/2006/main" xmlns:m="http://schemas.openxmlformats.org/officeDocument/2006/math" xmlns:r="http://schemas.openxmlformats.org/officeDocument/2006/relationships" xmlns:o="urn:schemas-microsoft-com:office:office" xmlns:v="urn:schemas-microsoft-com:vml" xmlns:w10="urn:schemas-microsoft-com:office:word" xmlns:a="http://schemas.openxmlformats.org/drawingml/2006/main" xmlns:pic="http://schemas.openxmlformats.org/drawingml/2006/picture" xmlns:wp="http://schemas.openxmlformats.org/drawingml/2006/wordprocessingDrawing">
   <w:body>
-    <w:bookmarkStart w:id="110" w:name="X62b9a812b91b110aef2b3b9d92896b25778a246"/>
+    <w:bookmarkStart w:id="111" w:name="X62b9a812b91b110aef2b3b9d92896b25778a246"/>
     <w:p>
       <w:pPr>
         <w:pStyle w:val="Heading1"/>
@@ -134,7 +134,7 @@
       </w:r>
     </w:p>
     <w:bookmarkEnd w:id="9"/>
-    <w:bookmarkStart w:id="31" w:name="Xa489d4d9bde5952001083000e99262b3fdd6992"/>
+    <w:bookmarkStart w:id="32" w:name="Xa489d4d9bde5952001083000e99262b3fdd6992"/>
     <w:p>
       <w:pPr>
         <w:pStyle w:val="Heading2"/>
@@ -2643,9 +2643,71 @@
           </w:p>
         </w:tc>
       </w:tr>
+      <w:tr>
+        <w:tc>
+          <w:tcPr/>
+          <w:p>
+            <w:pPr>
+              <w:pStyle w:val="Compact"/>
+            </w:pPr>
+            <w:r>
+              <w:t xml:space="preserve">1.13</w:t>
+            </w:r>
+          </w:p>
+        </w:tc>
+        <w:tc>
+          <w:tcPr/>
+          <w:p>
+            <w:pPr>
+              <w:pStyle w:val="Compact"/>
+            </w:pPr>
+            <w:r>
+              <w:t xml:space="preserve">2026-10-27</w:t>
+            </w:r>
+          </w:p>
+        </w:tc>
+        <w:tc>
+          <w:tcPr/>
+          <w:p>
+            <w:pPr>
+              <w:pStyle w:val="Compact"/>
+            </w:pPr>
+            <w:r>
+              <w:t xml:space="preserve">Development team</w:t>
+            </w:r>
+          </w:p>
+        </w:tc>
+        <w:tc>
+          <w:tcPr/>
+          <w:p>
+            <w:pPr>
+              <w:pStyle w:val="Compact"/>
+            </w:pPr>
+            <w:r>
+              <w:t xml:space="preserve">payment-service release</w:t>
+            </w:r>
+            <w:r>
+              <w:t xml:space="preserve"> </w:t>
+            </w:r>
+            <w:r>
+              <w:rPr>
+                <w:i/>
+                <w:iCs/>
+              </w:rPr>
+              <w:t xml:space="preserve">v1.1.3</w:t>
+            </w:r>
+            <w:r>
+              <w:t xml:space="preserve"> </w:t>
+            </w:r>
+            <w:r>
+              <w:t xml:space="preserve">approved and pending publication, with what it requires in production (1.3.14).</w:t>
+            </w:r>
+          </w:p>
+        </w:tc>
+      </w:tr>
     </w:tbl>
     <w:bookmarkEnd w:id="16"/>
-    <w:bookmarkStart w:id="30" w:name="Xcd1b6120617eac8b6d7b77232663333bd560904"/>
+    <w:bookmarkStart w:id="31" w:name="Xcd1b6120617eac8b6d7b77232663333bd560904"/>
     <w:p>
       <w:pPr>
         <w:pStyle w:val="Heading3"/>
@@ -8211,6 +8273,361 @@
         <w:t xml:space="preserve">6 («La huella coincide: la actualización le llega al APK publicado») and the update was published over the internet, without a new APK.</w:t>
       </w:r>
     </w:p>
+    <w:bookmarkEnd w:id="29"/>
+    <w:bookmarkStart w:id="30" w:name="X645a43a4558ecaab912137f2f04fc816b7fe1ba"/>
+    <w:p>
+      <w:pPr>
+        <w:pStyle w:val="Heading4"/>
+      </w:pPr>
+      <w:r>
+        <w:t xml:space="preserve">1.3.14 payment-service v1.1.3: approved, pending publication (2026-10-27)</w:t>
+      </w:r>
+    </w:p>
+    <w:p>
+      <w:pPr>
+        <w:pStyle w:val="Compact"/>
+        <w:numPr>
+          <w:ilvl w:val="0"/>
+          <w:numId w:val="1021"/>
+        </w:numPr>
+      </w:pPr>
+      <w:r>
+        <w:rPr>
+          <w:b/>
+          <w:bCs/>
+        </w:rPr>
+        <w:t xml:space="preserve">What it brings (PR #15 and release PR #16, approved by Brayan Patiño).</w:t>
+      </w:r>
+      <w:r>
+        <w:t xml:space="preserve"> </w:t>
+      </w:r>
+      <w:r>
+        <w:t xml:space="preserve">No passwords in the code: the end-to-end script reads</w:t>
+      </w:r>
+      <w:r>
+        <w:t xml:space="preserve"> </w:t>
+      </w:r>
+      <w:r>
+        <w:rPr>
+          <w:rStyle w:val="VerbatimChar"/>
+        </w:rPr>
+        <w:t xml:space="preserve">DEMO_CLIENT_PASSWORD</w:t>
+      </w:r>
+      <w:r>
+        <w:t xml:space="preserve"> </w:t>
+      </w:r>
+      <w:r>
+        <w:t xml:space="preserve">and</w:t>
+      </w:r>
+      <w:r>
+        <w:t xml:space="preserve"> </w:t>
+      </w:r>
+      <w:r>
+        <w:rPr>
+          <w:rStyle w:val="VerbatimChar"/>
+        </w:rPr>
+        <w:t xml:space="preserve">DEMO_ADMIN_PASSWORD</w:t>
+      </w:r>
+      <w:r>
+        <w:t xml:space="preserve"> </w:t>
+      </w:r>
+      <w:r>
+        <w:t xml:space="preserve">from the environment or</w:t>
+      </w:r>
+      <w:r>
+        <w:t xml:space="preserve"> </w:t>
+      </w:r>
+      <w:r>
+        <w:rPr>
+          <w:rStyle w:val="VerbatimChar"/>
+        </w:rPr>
+        <w:t xml:space="preserve">lavarapido-infra/.env</w:t>
+      </w:r>
+      <w:r>
+        <w:t xml:space="preserve">. The service does not start without</w:t>
+      </w:r>
+      <w:r>
+        <w:t xml:space="preserve"> </w:t>
+      </w:r>
+      <w:r>
+        <w:rPr>
+          <w:rStyle w:val="VerbatimChar"/>
+        </w:rPr>
+        <w:t xml:space="preserve">DB_PASSWORD</w:t>
+      </w:r>
+      <w:r>
+        <w:t xml:space="preserve"> </w:t>
+      </w:r>
+      <w:r>
+        <w:t xml:space="preserve">and, with</w:t>
+      </w:r>
+      <w:r>
+        <w:t xml:space="preserve"> </w:t>
+      </w:r>
+      <w:r>
+        <w:rPr>
+          <w:rStyle w:val="VerbatimChar"/>
+        </w:rPr>
+        <w:t xml:space="preserve">MESSAGING_ENABLED=true</w:t>
+      </w:r>
+      <w:r>
+        <w:t xml:space="preserve"> </w:t>
+      </w:r>
+      <w:r>
+        <w:t xml:space="preserve">against a remote RabbitMQ, not without</w:t>
+      </w:r>
+      <w:r>
+        <w:t xml:space="preserve"> </w:t>
+      </w:r>
+      <w:r>
+        <w:rPr>
+          <w:rStyle w:val="VerbatimChar"/>
+        </w:rPr>
+        <w:t xml:space="preserve">RABBITMQ_USERNAME</w:t>
+      </w:r>
+      <w:r>
+        <w:t xml:space="preserve"> </w:t>
+      </w:r>
+      <w:r>
+        <w:t xml:space="preserve">and</w:t>
+      </w:r>
+      <w:r>
+        <w:t xml:space="preserve"> </w:t>
+      </w:r>
+      <w:r>
+        <w:rPr>
+          <w:rStyle w:val="VerbatimChar"/>
+        </w:rPr>
+        <w:t xml:space="preserve">RABBITMQ_PASSWORD</w:t>
+      </w:r>
+      <w:r>
+        <w:t xml:space="preserve"> </w:t>
+      </w:r>
+      <w:r>
+        <w:t xml:space="preserve">either (</w:t>
+      </w:r>
+      <w:r>
+        <w:rPr>
+          <w:rStyle w:val="VerbatimChar"/>
+        </w:rPr>
+        <w:t xml:space="preserve">guest</w:t>
+      </w:r>
+      <w:r>
+        <w:t xml:space="preserve"> </w:t>
+      </w:r>
+      <w:r>
+        <w:t xml:space="preserve">only with a local RabbitMQ).</w:t>
+      </w:r>
+      <w:r>
+        <w:t xml:space="preserve"> </w:t>
+      </w:r>
+      <w:r>
+        <w:rPr>
+          <w:rStyle w:val="VerbatimChar"/>
+        </w:rPr>
+        <w:t xml:space="preserve">.gitignore</w:t>
+      </w:r>
+      <w:r>
+        <w:t xml:space="preserve"> </w:t>
+      </w:r>
+      <w:r>
+        <w:t xml:space="preserve">covers any</w:t>
+      </w:r>
+      <w:r>
+        <w:t xml:space="preserve"> </w:t>
+      </w:r>
+      <w:r>
+        <w:rPr>
+          <w:rStyle w:val="VerbatimChar"/>
+        </w:rPr>
+        <w:t xml:space="preserve">.env.*</w:t>
+      </w:r>
+      <w:r>
+        <w:t xml:space="preserve">. The local test database moves to SQL Server 2022 and</w:t>
+      </w:r>
+      <w:r>
+        <w:t xml:space="preserve"> </w:t>
+      </w:r>
+      <w:r>
+        <w:rPr>
+          <w:rStyle w:val="VerbatimChar"/>
+        </w:rPr>
+        <w:t xml:space="preserve">LavaRapidoPaymentIT</w:t>
+      </w:r>
+      <w:r>
+        <w:t xml:space="preserve">, like the CI, and the end-to-end script passes again (payment method when booking and a digital account). Tests: 275 in the CI (domain 142, application 61, API 47, and 25 in the infrastructure project, 12 of them against SQL Server).</w:t>
+      </w:r>
+    </w:p>
+    <w:p>
+      <w:pPr>
+        <w:pStyle w:val="Compact"/>
+        <w:numPr>
+          <w:ilvl w:val="0"/>
+          <w:numId w:val="1021"/>
+        </w:numPr>
+      </w:pPr>
+      <w:r>
+        <w:rPr>
+          <w:b/>
+          <w:bCs/>
+        </w:rPr>
+        <w:t xml:space="preserve">Production already meets those checks:</w:t>
+      </w:r>
+      <w:r>
+        <w:t xml:space="preserve"> </w:t>
+      </w:r>
+      <w:r>
+        <w:rPr>
+          <w:rStyle w:val="VerbatimChar"/>
+        </w:rPr>
+        <w:t xml:space="preserve">docker-compose.prod.yml</w:t>
+      </w:r>
+      <w:r>
+        <w:t xml:space="preserve"> </w:t>
+      </w:r>
+      <w:r>
+        <w:t xml:space="preserve">requires</w:t>
+      </w:r>
+      <w:r>
+        <w:t xml:space="preserve"> </w:t>
+      </w:r>
+      <w:r>
+        <w:rPr>
+          <w:rStyle w:val="VerbatimChar"/>
+        </w:rPr>
+        <w:t xml:space="preserve">RABBITMQ_USERNAME</w:t>
+      </w:r>
+      <w:r>
+        <w:t xml:space="preserve"> </w:t>
+      </w:r>
+      <w:r>
+        <w:t xml:space="preserve">and</w:t>
+      </w:r>
+      <w:r>
+        <w:t xml:space="preserve"> </w:t>
+      </w:r>
+      <w:r>
+        <w:rPr>
+          <w:rStyle w:val="VerbatimChar"/>
+        </w:rPr>
+        <w:t xml:space="preserve">RABBITMQ_PASSWORD</w:t>
+      </w:r>
+      <w:r>
+        <w:t xml:space="preserve"> </w:t>
+      </w:r>
+      <w:r>
+        <w:t xml:space="preserve">in</w:t>
+      </w:r>
+      <w:r>
+        <w:t xml:space="preserve"> </w:t>
+      </w:r>
+      <w:r>
+        <w:rPr>
+          <w:rStyle w:val="VerbatimChar"/>
+        </w:rPr>
+        <w:t xml:space="preserve">.env.production</w:t>
+      </w:r>
+      <w:r>
+        <w:t xml:space="preserve"> </w:t>
+      </w:r>
+      <w:r>
+        <w:t xml:space="preserve">and passes</w:t>
+      </w:r>
+      <w:r>
+        <w:t xml:space="preserve"> </w:t>
+      </w:r>
+      <w:r>
+        <w:rPr>
+          <w:rStyle w:val="VerbatimChar"/>
+        </w:rPr>
+        <w:t xml:space="preserve">DB_PASSWORD</w:t>
+      </w:r>
+      <w:r>
+        <w:t xml:space="preserve"> </w:t>
+      </w:r>
+      <w:r>
+        <w:t xml:space="preserve">to payment;</w:t>
+      </w:r>
+      <w:r>
+        <w:t xml:space="preserve"> </w:t>
+      </w:r>
+      <w:r>
+        <w:rPr>
+          <w:rStyle w:val="VerbatimChar"/>
+        </w:rPr>
+        <w:t xml:space="preserve">/actuator/health</w:t>
+      </w:r>
+      <w:r>
+        <w:t xml:space="preserve"> </w:t>
+      </w:r>
+      <w:r>
+        <w:t xml:space="preserve">still answers</w:t>
+      </w:r>
+      <w:r>
+        <w:t xml:space="preserve"> </w:t>
+      </w:r>
+      <w:r>
+        <w:rPr>
+          <w:rStyle w:val="VerbatimChar"/>
+        </w:rPr>
+        <w:t xml:space="preserve">{"status":"UP"}</w:t>
+      </w:r>
+      <w:r>
+        <w:t xml:space="preserve">. Merging PR #16 into</w:t>
+      </w:r>
+      <w:r>
+        <w:t xml:space="preserve"> </w:t>
+      </w:r>
+      <w:r>
+        <w:rPr>
+          <w:rStyle w:val="VerbatimChar"/>
+        </w:rPr>
+        <w:t xml:space="preserve">main</w:t>
+      </w:r>
+      <w:r>
+        <w:t xml:space="preserve"> </w:t>
+      </w:r>
+      <w:r>
+        <w:t xml:space="preserve">publishes it on Azure through continuous deployment (section 4.3.4); those three variables should be confirmed in the server's</w:t>
+      </w:r>
+      <w:r>
+        <w:t xml:space="preserve"> </w:t>
+      </w:r>
+      <w:r>
+        <w:rPr>
+          <w:rStyle w:val="VerbatimChar"/>
+        </w:rPr>
+        <w:t xml:space="preserve">.env.production</w:t>
+      </w:r>
+      <w:r>
+        <w:t xml:space="preserve"> </w:t>
+      </w:r>
+      <w:r>
+        <w:t xml:space="preserve">first.</w:t>
+      </w:r>
+    </w:p>
+    <w:p>
+      <w:pPr>
+        <w:pStyle w:val="Compact"/>
+        <w:numPr>
+          <w:ilvl w:val="0"/>
+          <w:numId w:val="1021"/>
+        </w:numPr>
+      </w:pPr>
+      <w:r>
+        <w:rPr>
+          <w:b/>
+          <w:bCs/>
+        </w:rPr>
+        <w:t xml:space="preserve">Pending security item (ACO-25).</w:t>
+      </w:r>
+      <w:r>
+        <w:t xml:space="preserve"> </w:t>
+      </w:r>
+      <w:r>
+        <w:t xml:space="preserve">payment-service's Git history still holds two old SQL Server passwords and the demo account ones; if any SQL Server one is used on the server, it must be changed.</w:t>
+      </w:r>
+    </w:p>
     <w:p>
       <w:r>
         <w:pict>
@@ -8218,10 +8635,10 @@
         </w:pict>
       </w:r>
     </w:p>
-    <w:bookmarkEnd w:id="29"/>
     <w:bookmarkEnd w:id="30"/>
     <w:bookmarkEnd w:id="31"/>
-    <w:bookmarkStart w:id="42" w:name="X2349cf2eb0ee80049c42f82e7649865e9b85d77"/>
+    <w:bookmarkEnd w:id="32"/>
+    <w:bookmarkStart w:id="43" w:name="X2349cf2eb0ee80049c42f82e7649865e9b85d77"/>
     <w:p>
       <w:pPr>
         <w:pStyle w:val="Heading2"/>
@@ -8230,7 +8647,7 @@
         <w:t xml:space="preserve">2. Scope, Topology and Architecture</w:t>
       </w:r>
     </w:p>
-    <w:bookmarkStart w:id="36" w:name="Xef9e86d3c6c5e309e877c07e265de2ff60fc8df"/>
+    <w:bookmarkStart w:id="37" w:name="Xef9e86d3c6c5e309e877c07e265de2ff60fc8df"/>
     <w:p>
       <w:pPr>
         <w:pStyle w:val="Heading3"/>
@@ -8239,7 +8656,7 @@
         <w:t xml:space="preserve">2.1 Components and Artifacts in Scope</w:t>
       </w:r>
     </w:p>
-    <w:bookmarkStart w:id="32" w:name="X02af1b1067938bff50e28f386d0b6d1cd4d51cb"/>
+    <w:bookmarkStart w:id="33" w:name="X02af1b1067938bff50e28f386d0b6d1cd4d51cb"/>
     <w:p>
       <w:pPr>
         <w:pStyle w:val="Heading4"/>
@@ -8468,8 +8885,8 @@
         </w:tc>
       </w:tr>
     </w:tbl>
-    <w:bookmarkEnd w:id="32"/>
-    <w:bookmarkStart w:id="33" w:name="Xc8a2baaf949548f127b9db069675f9de6778d17"/>
+    <w:bookmarkEnd w:id="33"/>
+    <w:bookmarkStart w:id="34" w:name="Xc8a2baaf949548f127b9db069675f9de6778d17"/>
     <w:p>
       <w:pPr>
         <w:pStyle w:val="Heading4"/>
@@ -8732,8 +9149,8 @@
         </w:tc>
       </w:tr>
     </w:tbl>
-    <w:bookmarkEnd w:id="33"/>
-    <w:bookmarkStart w:id="34" w:name="X15785bfa89a0af0522d2c8aa876b98d281aa599"/>
+    <w:bookmarkEnd w:id="34"/>
+    <w:bookmarkStart w:id="35" w:name="X15785bfa89a0af0522d2c8aa876b98d281aa599"/>
     <w:p>
       <w:pPr>
         <w:pStyle w:val="Heading4"/>
@@ -9193,8 +9610,8 @@
         </w:tc>
       </w:tr>
     </w:tbl>
-    <w:bookmarkEnd w:id="34"/>
-    <w:bookmarkStart w:id="35" w:name="Xa20a639fd2127ffdf434f730c9bb0f43e877d9d"/>
+    <w:bookmarkEnd w:id="35"/>
+    <w:bookmarkStart w:id="36" w:name="Xa20a639fd2127ffdf434f730c9bb0f43e877d9d"/>
     <w:p>
       <w:pPr>
         <w:pStyle w:val="Heading4"/>
@@ -9618,9 +10035,9 @@
         </w:tc>
       </w:tr>
     </w:tbl>
-    <w:bookmarkEnd w:id="35"/>
     <w:bookmarkEnd w:id="36"/>
-    <w:bookmarkStart w:id="40" w:name="Xedfd4760f3b30ee50ba1fbcf180ac660df7aa1d"/>
+    <w:bookmarkEnd w:id="37"/>
+    <w:bookmarkStart w:id="41" w:name="Xedfd4760f3b30ee50ba1fbcf180ac660df7aa1d"/>
     <w:p>
       <w:pPr>
         <w:pStyle w:val="Heading3"/>
@@ -9629,7 +10046,7 @@
         <w:t xml:space="preserve">2.2 Network and Infrastructure Architecture Diagram</w:t>
       </w:r>
     </w:p>
-    <w:bookmarkStart w:id="37" w:name="Xadec88b09a3f7f073c691dcc687c629e76cbf9b"/>
+    <w:bookmarkStart w:id="38" w:name="Xadec88b09a3f7f073c691dcc687c629e76cbf9b"/>
     <w:p>
       <w:pPr>
         <w:pStyle w:val="Heading4"/>
@@ -9643,11 +10060,11 @@
         <w:pStyle w:val="FirstParagraph"/>
       </w:pPr>
       <w:r>
-        <w:t xml:space="preserve">![Diagrama](C:/Users/JUAN CAMILO/Documents/PROYECTO FINAL_LAVADO VEICULAR/lavarapido-docs/_generador/work/mermaid/deployment_document_md-1.png)</w:t>
-      </w:r>
-    </w:p>
-    <w:bookmarkEnd w:id="37"/>
-    <w:bookmarkStart w:id="38" w:name="X1a22319ff1b54a8fe5b2bf0e11fcfd976e690c1"/>
+        <w:t xml:space="preserve">![Diagrama](C:/Users/MERARI URBANO/Lavado-Vehicular/lavarapido-docs/_generador/work/mermaid/deployment_document_md-1.png)</w:t>
+      </w:r>
+    </w:p>
+    <w:bookmarkEnd w:id="38"/>
+    <w:bookmarkStart w:id="39" w:name="X1a22319ff1b54a8fe5b2bf0e11fcfd976e690c1"/>
     <w:p>
       <w:pPr>
         <w:pStyle w:val="Heading4"/>
@@ -9661,7 +10078,7 @@
         <w:pStyle w:val="Compact"/>
         <w:numPr>
           <w:ilvl w:val="0"/>
-          <w:numId w:val="1021"/>
+          <w:numId w:val="1022"/>
         </w:numPr>
       </w:pPr>
       <w:r>
@@ -9687,7 +10104,7 @@
         <w:pStyle w:val="Compact"/>
         <w:numPr>
           <w:ilvl w:val="0"/>
-          <w:numId w:val="1021"/>
+          <w:numId w:val="1022"/>
         </w:numPr>
       </w:pPr>
       <w:r>
@@ -9784,7 +10201,7 @@
         <w:pStyle w:val="Compact"/>
         <w:numPr>
           <w:ilvl w:val="0"/>
-          <w:numId w:val="1021"/>
+          <w:numId w:val="1022"/>
         </w:numPr>
       </w:pPr>
       <w:r>
@@ -9845,15 +10262,15 @@
         <w:pStyle w:val="Compact"/>
         <w:numPr>
           <w:ilvl w:val="0"/>
-          <w:numId w:val="1021"/>
+          <w:numId w:val="1022"/>
         </w:numPr>
       </w:pPr>
       <w:r>
         <w:t xml:space="preserve">No port of the internal network is published on the machine, except Caddy's.</w:t>
       </w:r>
     </w:p>
-    <w:bookmarkEnd w:id="38"/>
-    <w:bookmarkStart w:id="39" w:name="Xe4ded7be0585f80aeffccb076bf95d1df4db4b1"/>
+    <w:bookmarkEnd w:id="39"/>
+    <w:bookmarkStart w:id="40" w:name="Xe4ded7be0585f80aeffccb076bf95d1df4db4b1"/>
     <w:p>
       <w:pPr>
         <w:pStyle w:val="Heading4"/>
@@ -10135,7 +10552,7 @@
         <w:pStyle w:val="Compact"/>
         <w:numPr>
           <w:ilvl w:val="0"/>
-          <w:numId w:val="1022"/>
+          <w:numId w:val="1023"/>
         </w:numPr>
       </w:pPr>
       <w:r>
@@ -10172,7 +10589,7 @@
         <w:pStyle w:val="Compact"/>
         <w:numPr>
           <w:ilvl w:val="0"/>
-          <w:numId w:val="1022"/>
+          <w:numId w:val="1023"/>
         </w:numPr>
       </w:pPr>
       <w:r>
@@ -10206,7 +10623,7 @@
         <w:pStyle w:val="Compact"/>
         <w:numPr>
           <w:ilvl w:val="0"/>
-          <w:numId w:val="1022"/>
+          <w:numId w:val="1023"/>
         </w:numPr>
       </w:pPr>
       <w:r>
@@ -10294,7 +10711,7 @@
         <w:pStyle w:val="Compact"/>
         <w:numPr>
           <w:ilvl w:val="0"/>
-          <w:numId w:val="1022"/>
+          <w:numId w:val="1023"/>
         </w:numPr>
       </w:pPr>
       <w:r>
@@ -10317,9 +10734,9 @@
         <w:t xml:space="preserve">.</w:t>
       </w:r>
     </w:p>
-    <w:bookmarkEnd w:id="39"/>
     <w:bookmarkEnd w:id="40"/>
-    <w:bookmarkStart w:id="41" w:name="X82406acaaaf5a6f11f5d5d368052b08ff3102f1"/>
+    <w:bookmarkEnd w:id="41"/>
+    <w:bookmarkStart w:id="42" w:name="X82406acaaaf5a6f11f5d5d368052b08ff3102f1"/>
     <w:p>
       <w:pPr>
         <w:pStyle w:val="Heading3"/>
@@ -10841,9 +11258,9 @@
         </w:pict>
       </w:r>
     </w:p>
-    <w:bookmarkEnd w:id="41"/>
     <w:bookmarkEnd w:id="42"/>
-    <w:bookmarkStart w:id="56" w:name="Xa95493a4943540bb8fda6d550001e5275bde913"/>
+    <w:bookmarkEnd w:id="43"/>
+    <w:bookmarkStart w:id="57" w:name="Xa95493a4943540bb8fda6d550001e5275bde913"/>
     <w:p>
       <w:pPr>
         <w:pStyle w:val="Heading2"/>
@@ -10852,7 +11269,7 @@
         <w:t xml:space="preserve">3. Prerequisites and Preparation (Pre-deployment)</w:t>
       </w:r>
     </w:p>
-    <w:bookmarkStart w:id="45" w:name="X10d4d5604758826f2ce5a23136de09621bb83eb"/>
+    <w:bookmarkStart w:id="46" w:name="X10d4d5604758826f2ce5a23136de09621bb83eb"/>
     <w:p>
       <w:pPr>
         <w:pStyle w:val="Heading3"/>
@@ -10861,7 +11278,7 @@
         <w:t xml:space="preserve">3.1 Operating System and VPS Prerequisites Checklist</w:t>
       </w:r>
     </w:p>
-    <w:bookmarkStart w:id="43" w:name="Xcdcbb5e54f8975fce3d0dcc47e68bb032af35cc"/>
+    <w:bookmarkStart w:id="44" w:name="Xcdcbb5e54f8975fce3d0dcc47e68bb032af35cc"/>
     <w:p>
       <w:pPr>
         <w:pStyle w:val="Heading4"/>
@@ -11239,8 +11656,8 @@
         </w:tc>
       </w:tr>
     </w:tbl>
-    <w:bookmarkEnd w:id="43"/>
-    <w:bookmarkStart w:id="44" w:name="X2d870752a54b67e5a0135d7ffcb4e5321c8ed2f"/>
+    <w:bookmarkEnd w:id="44"/>
+    <w:bookmarkStart w:id="45" w:name="X2d870752a54b67e5a0135d7ffcb4e5321c8ed2f"/>
     <w:p>
       <w:pPr>
         <w:pStyle w:val="Heading4"/>
@@ -11412,9 +11829,9 @@
         <w:t xml:space="preserve">script) if missing, enables it on boot and creates 4 GB of swap.</w:t>
       </w:r>
     </w:p>
-    <w:bookmarkEnd w:id="44"/>
     <w:bookmarkEnd w:id="45"/>
-    <w:bookmarkStart w:id="50" w:name="X349fa7fd08898295351629450001c559236695b"/>
+    <w:bookmarkEnd w:id="46"/>
+    <w:bookmarkStart w:id="51" w:name="X349fa7fd08898295351629450001c559236695b"/>
     <w:p>
       <w:pPr>
         <w:pStyle w:val="Heading3"/>
@@ -11441,7 +11858,7 @@
         <w:t xml:space="preserve">Backups, their check and restoring were tested in production (see 3.2.4).</w:t>
       </w:r>
     </w:p>
-    <w:bookmarkStart w:id="46" w:name="Xbeacd7514bf58fc6a804ead7156a209eb70fa16"/>
+    <w:bookmarkStart w:id="47" w:name="Xbeacd7514bf58fc6a804ead7156a209eb70fa16"/>
     <w:p>
       <w:pPr>
         <w:pStyle w:val="Heading4"/>
@@ -11865,8 +12282,8 @@
         <w:t xml:space="preserve"> .</w:t>
       </w:r>
     </w:p>
-    <w:bookmarkEnd w:id="46"/>
-    <w:bookmarkStart w:id="47" w:name="X1492a74e05fac6d852c5e9d4e197021994af2b7"/>
+    <w:bookmarkEnd w:id="47"/>
+    <w:bookmarkStart w:id="48" w:name="X1492a74e05fac6d852c5e9d4e197021994af2b7"/>
     <w:p>
       <w:pPr>
         <w:pStyle w:val="Heading4"/>
@@ -12155,8 +12572,8 @@
         <w:t xml:space="preserve">from 3.2.1 is preferred, because it can be done while the database is running.</w:t>
       </w:r>
     </w:p>
-    <w:bookmarkEnd w:id="47"/>
-    <w:bookmarkStart w:id="48" w:name="X6ee5698c953cd28898d14aeced68cff290faadf"/>
+    <w:bookmarkEnd w:id="48"/>
+    <w:bookmarkStart w:id="49" w:name="X6ee5698c953cd28898d14aeced68cff290faadf"/>
     <w:p>
       <w:pPr>
         <w:pStyle w:val="Heading4"/>
@@ -12403,8 +12820,8 @@
         <w:t xml:space="preserve">are enough.</w:t>
       </w:r>
     </w:p>
-    <w:bookmarkEnd w:id="48"/>
-    <w:bookmarkStart w:id="49" w:name="X28e9ce19a7d7f4bf4949c38f414d1473cc5783f"/>
+    <w:bookmarkEnd w:id="49"/>
+    <w:bookmarkStart w:id="50" w:name="X28e9ce19a7d7f4bf4949c38f414d1473cc5783f"/>
     <w:p>
       <w:pPr>
         <w:pStyle w:val="Heading4"/>
@@ -12962,9 +13379,9 @@
         </w:tc>
       </w:tr>
     </w:tbl>
-    <w:bookmarkEnd w:id="49"/>
     <w:bookmarkEnd w:id="50"/>
-    <w:bookmarkStart w:id="54" w:name="X6235f3b37ad3b374c48e8535e43b399014f34df"/>
+    <w:bookmarkEnd w:id="51"/>
+    <w:bookmarkStart w:id="55" w:name="X6235f3b37ad3b374c48e8535e43b399014f34df"/>
     <w:p>
       <w:pPr>
         <w:pStyle w:val="Heading3"/>
@@ -12978,7 +13395,7 @@
         <w:pStyle w:val="Compact"/>
         <w:numPr>
           <w:ilvl w:val="0"/>
-          <w:numId w:val="1023"/>
+          <w:numId w:val="1024"/>
         </w:numPr>
       </w:pPr>
       <w:r>
@@ -13045,7 +13462,7 @@
         <w:pStyle w:val="Compact"/>
         <w:numPr>
           <w:ilvl w:val="0"/>
-          <w:numId w:val="1023"/>
+          <w:numId w:val="1024"/>
         </w:numPr>
       </w:pPr>
       <w:r>
@@ -13069,7 +13486,7 @@
         <w:pStyle w:val="Compact"/>
         <w:numPr>
           <w:ilvl w:val="0"/>
-          <w:numId w:val="1023"/>
+          <w:numId w:val="1024"/>
         </w:numPr>
       </w:pPr>
       <w:r>
@@ -13122,7 +13539,7 @@
         <w:pStyle w:val="Compact"/>
         <w:numPr>
           <w:ilvl w:val="0"/>
-          <w:numId w:val="1023"/>
+          <w:numId w:val="1024"/>
         </w:numPr>
       </w:pPr>
       <w:r>
@@ -13193,7 +13610,7 @@
         <w:t xml:space="preserve">). The password is not in any repository.</w:t>
       </w:r>
     </w:p>
-    <w:bookmarkStart w:id="51" w:name="X0085fc3a55375be0c6ec480d5da8cc3164000a6"/>
+    <w:bookmarkStart w:id="52" w:name="X0085fc3a55375be0c6ec480d5da8cc3164000a6"/>
     <w:p>
       <w:pPr>
         <w:pStyle w:val="Heading4"/>
@@ -13382,8 +13799,8 @@
         </w:tc>
       </w:tr>
     </w:tbl>
-    <w:bookmarkEnd w:id="51"/>
-    <w:bookmarkStart w:id="52" w:name="Xc0335d0a755a906bd04380bd4eddb41159245ab"/>
+    <w:bookmarkEnd w:id="52"/>
+    <w:bookmarkStart w:id="53" w:name="Xc0335d0a755a906bd04380bd4eddb41159245ab"/>
     <w:p>
       <w:pPr>
         <w:pStyle w:val="Heading4"/>
@@ -15171,8 +15588,8 @@
         </w:tc>
       </w:tr>
     </w:tbl>
-    <w:bookmarkEnd w:id="52"/>
-    <w:bookmarkStart w:id="53" w:name="X3395c7c8fe7d7acb9c508908933b4400c9a7aa5"/>
+    <w:bookmarkEnd w:id="53"/>
+    <w:bookmarkStart w:id="54" w:name="X3395c7c8fe7d7acb9c508908933b4400c9a7aa5"/>
     <w:p>
       <w:pPr>
         <w:pStyle w:val="Heading4"/>
@@ -15531,9 +15948,9 @@
         </w:tc>
       </w:tr>
     </w:tbl>
-    <w:bookmarkEnd w:id="53"/>
     <w:bookmarkEnd w:id="54"/>
-    <w:bookmarkStart w:id="55" w:name="X2908c3fc9dfc8fad718c3ba7d16055cc1787c07"/>
+    <w:bookmarkEnd w:id="55"/>
+    <w:bookmarkStart w:id="56" w:name="X2908c3fc9dfc8fad718c3ba7d16055cc1787c07"/>
     <w:p>
       <w:pPr>
         <w:pStyle w:val="Heading3"/>
@@ -15547,7 +15964,7 @@
         <w:pStyle w:val="Compact"/>
         <w:numPr>
           <w:ilvl w:val="0"/>
-          <w:numId w:val="1024"/>
+          <w:numId w:val="1025"/>
         </w:numPr>
       </w:pPr>
       <w:r>
@@ -15569,7 +15986,7 @@
         <w:pStyle w:val="Compact"/>
         <w:numPr>
           <w:ilvl w:val="0"/>
-          <w:numId w:val="1024"/>
+          <w:numId w:val="1025"/>
         </w:numPr>
       </w:pPr>
       <w:r>
@@ -15621,7 +16038,7 @@
         <w:pStyle w:val="Compact"/>
         <w:numPr>
           <w:ilvl w:val="0"/>
-          <w:numId w:val="1024"/>
+          <w:numId w:val="1025"/>
         </w:numPr>
       </w:pPr>
       <w:r>
@@ -15658,7 +16075,7 @@
         <w:pStyle w:val="Compact"/>
         <w:numPr>
           <w:ilvl w:val="0"/>
-          <w:numId w:val="1024"/>
+          <w:numId w:val="1025"/>
         </w:numPr>
       </w:pPr>
       <w:r>
@@ -15680,7 +16097,7 @@
         <w:pStyle w:val="Compact"/>
         <w:numPr>
           <w:ilvl w:val="0"/>
-          <w:numId w:val="1024"/>
+          <w:numId w:val="1025"/>
         </w:numPr>
       </w:pPr>
       <w:r>
@@ -15702,7 +16119,7 @@
         <w:pStyle w:val="Compact"/>
         <w:numPr>
           <w:ilvl w:val="0"/>
-          <w:numId w:val="1024"/>
+          <w:numId w:val="1025"/>
         </w:numPr>
       </w:pPr>
       <w:r>
@@ -15806,7 +16223,7 @@
         <w:pStyle w:val="Compact"/>
         <w:numPr>
           <w:ilvl w:val="1"/>
-          <w:numId w:val="1025"/>
+          <w:numId w:val="1026"/>
         </w:numPr>
       </w:pPr>
       <w:r>
@@ -15885,7 +16302,7 @@
         <w:pStyle w:val="Compact"/>
         <w:numPr>
           <w:ilvl w:val="1"/>
-          <w:numId w:val="1025"/>
+          <w:numId w:val="1026"/>
         </w:numPr>
       </w:pPr>
       <w:r>
@@ -16058,7 +16475,7 @@
         <w:pStyle w:val="Compact"/>
         <w:numPr>
           <w:ilvl w:val="1"/>
-          <w:numId w:val="1025"/>
+          <w:numId w:val="1026"/>
         </w:numPr>
       </w:pPr>
       <w:r>
@@ -16141,7 +16558,7 @@
         <w:pStyle w:val="Compact"/>
         <w:numPr>
           <w:ilvl w:val="0"/>
-          <w:numId w:val="1024"/>
+          <w:numId w:val="1025"/>
         </w:numPr>
       </w:pPr>
       <w:r>
@@ -16165,9 +16582,9 @@
         </w:pict>
       </w:r>
     </w:p>
-    <w:bookmarkEnd w:id="55"/>
     <w:bookmarkEnd w:id="56"/>
-    <w:bookmarkStart w:id="67" w:name="X3ea2f277268713fb164bd7ee3016bdffe9e369d"/>
+    <w:bookmarkEnd w:id="57"/>
+    <w:bookmarkStart w:id="68" w:name="X3ea2f277268713fb164bd7ee3016bdffe9e369d"/>
     <w:p>
       <w:pPr>
         <w:pStyle w:val="Heading2"/>
@@ -16176,7 +16593,7 @@
         <w:t xml:space="preserve">4. Step-by-Step Deployment Procedure (Runbook)</w:t>
       </w:r>
     </w:p>
-    <w:bookmarkStart w:id="57" w:name="X78fcd346f670f1db7ff67e70153f191b951fc94"/>
+    <w:bookmarkStart w:id="58" w:name="X78fcd346f670f1db7ff67e70153f191b951fc94"/>
     <w:p>
       <w:pPr>
         <w:pStyle w:val="Heading3"/>
@@ -16687,230 +17104,6 @@
           <w:rStyle w:val="CommentTok"/>
         </w:rPr>
         <w:t xml:space="preserve"># then open https://localhost:9443 → user "admin"</w:t>
-      </w:r>
-    </w:p>
-    <w:p>
-      <w:pPr>
-        <w:pStyle w:val="Compact"/>
-        <w:numPr>
-          <w:ilvl w:val="0"/>
-          <w:numId w:val="1026"/>
-        </w:numPr>
-      </w:pPr>
-      <w:r>
-        <w:rPr>
-          <w:b/>
-          <w:bCs/>
-        </w:rPr>
-        <w:t xml:space="preserve">Password of the</w:t>
-      </w:r>
-      <w:r>
-        <w:rPr>
-          <w:b/>
-          <w:bCs/>
-        </w:rPr>
-        <w:t xml:space="preserve"> </w:t>
-      </w:r>
-      <w:r>
-        <w:rPr>
-          <w:rStyle w:val="VerbatimChar"/>
-          <w:b/>
-          <w:bCs/>
-        </w:rPr>
-        <w:t xml:space="preserve">admin</w:t>
-      </w:r>
-      <w:r>
-        <w:rPr>
-          <w:b/>
-          <w:bCs/>
-        </w:rPr>
-        <w:t xml:space="preserve"> </w:t>
-      </w:r>
-      <w:r>
-        <w:rPr>
-          <w:b/>
-          <w:bCs/>
-        </w:rPr>
-        <w:t xml:space="preserve">user:</w:t>
-      </w:r>
-      <w:r>
-        <w:t xml:space="preserve"> </w:t>
-      </w:r>
-      <w:r>
-        <w:t xml:space="preserve">it was generated during installation and is on the server, in</w:t>
-      </w:r>
-      <w:r>
-        <w:t xml:space="preserve"> </w:t>
-      </w:r>
-      <w:r>
-        <w:rPr>
-          <w:rStyle w:val="VerbatimChar"/>
-        </w:rPr>
-        <w:t xml:space="preserve">~/portainer-admin-password</w:t>
-      </w:r>
-      <w:r>
-        <w:t xml:space="preserve"> </w:t>
-      </w:r>
-      <w:r>
-        <w:t xml:space="preserve">(permissions</w:t>
-      </w:r>
-      <w:r>
-        <w:t xml:space="preserve"> </w:t>
-      </w:r>
-      <w:r>
-        <w:rPr>
-          <w:rStyle w:val="VerbatimChar"/>
-        </w:rPr>
-        <w:t xml:space="preserve">600</w:t>
-      </w:r>
-      <w:r>
-        <w:t xml:space="preserve">). It is read with</w:t>
-      </w:r>
-      <w:r>
-        <w:t xml:space="preserve"> </w:t>
-      </w:r>
-      <w:r>
-        <w:rPr>
-          <w:rStyle w:val="VerbatimChar"/>
-        </w:rPr>
-        <w:t xml:space="preserve">cat ~/portainer-admin-password</w:t>
-      </w:r>
-      <w:r>
-        <w:t xml:space="preserve"> </w:t>
-      </w:r>
-      <w:r>
-        <w:t xml:space="preserve">and can be changed from Portainer (</w:t>
-      </w:r>
-      <w:r>
-        <w:rPr>
-          <w:i/>
-          <w:iCs/>
-        </w:rPr>
-        <w:t xml:space="preserve">My account</w:t>
-      </w:r>
-      <w:r>
-        <w:t xml:space="preserve">).</w:t>
-      </w:r>
-    </w:p>
-    <w:p>
-      <w:pPr>
-        <w:pStyle w:val="Compact"/>
-        <w:numPr>
-          <w:ilvl w:val="0"/>
-          <w:numId w:val="1026"/>
-        </w:numPr>
-      </w:pPr>
-      <w:r>
-        <w:rPr>
-          <w:rStyle w:val="VerbatimChar"/>
-          <w:b/>
-          <w:bCs/>
-        </w:rPr>
-        <w:t xml:space="preserve">local</w:t>
-      </w:r>
-      <w:r>
-        <w:rPr>
-          <w:b/>
-          <w:bCs/>
-        </w:rPr>
-        <w:t xml:space="preserve"> </w:t>
-      </w:r>
-      <w:r>
-        <w:rPr>
-          <w:b/>
-          <w:bCs/>
-        </w:rPr>
-        <w:t xml:space="preserve">environment:</w:t>
-      </w:r>
-      <w:r>
-        <w:t xml:space="preserve"> </w:t>
-      </w:r>
-      <w:r>
-        <w:t xml:space="preserve">registered on the Docker socket.</w:t>
-      </w:r>
-      <w:r>
-        <w:t xml:space="preserve"> </w:t>
-      </w:r>
-      <w:r>
-        <w:rPr>
-          <w:rStyle w:val="VerbatimChar"/>
-        </w:rPr>
-        <w:t xml:space="preserve">lavarapido</w:t>
-      </w:r>
-      <w:r>
-        <w:t xml:space="preserve"> </w:t>
-      </w:r>
-      <w:r>
-        <w:t xml:space="preserve">appears under</w:t>
-      </w:r>
-      <w:r>
-        <w:t xml:space="preserve"> </w:t>
-      </w:r>
-      <w:r>
-        <w:rPr>
-          <w:i/>
-          <w:iCs/>
-        </w:rPr>
-        <w:t xml:space="preserve">Containers</w:t>
-      </w:r>
-      <w:r>
-        <w:t xml:space="preserve"> </w:t>
-      </w:r>
-      <w:r>
-        <w:t xml:space="preserve">and</w:t>
-      </w:r>
-      <w:r>
-        <w:t xml:space="preserve"> </w:t>
-      </w:r>
-      <w:r>
-        <w:rPr>
-          <w:i/>
-          <w:iCs/>
-        </w:rPr>
-        <w:t xml:space="preserve">Stacks</w:t>
-      </w:r>
-      <w:r>
-        <w:t xml:space="preserve">.</w:t>
-      </w:r>
-    </w:p>
-    <w:bookmarkEnd w:id="57"/>
-    <w:bookmarkStart w:id="60" w:name="Xec87964eb7eea36b9bd79296133a88cceae8d4f"/>
-    <w:p>
-      <w:pPr>
-        <w:pStyle w:val="Heading3"/>
-      </w:pPr>
-      <w:r>
-        <w:t xml:space="preserve">4.2 Database Deployment and Migration</w:t>
-      </w:r>
-    </w:p>
-    <w:bookmarkStart w:id="58" w:name="X1c7abfdbfcfcf3845bb4ad74c832ceb28cc1f47"/>
-    <w:p>
-      <w:pPr>
-        <w:pStyle w:val="Heading4"/>
-      </w:pPr>
-      <w:r>
-        <w:t xml:space="preserve">4.2.1 Running DDL/DML scripts or migration tools (Liquibase)</w:t>
-      </w:r>
-    </w:p>
-    <w:p>
-      <w:pPr>
-        <w:pStyle w:val="FirstParagraph"/>
-      </w:pPr>
-      <w:r>
-        <w:t xml:space="preserve">Migrations are</w:t>
-      </w:r>
-      <w:r>
-        <w:t xml:space="preserve"> </w:t>
-      </w:r>
-      <w:r>
-        <w:rPr>
-          <w:b/>
-          <w:bCs/>
-        </w:rPr>
-        <w:t xml:space="preserve">automatic</w:t>
-      </w:r>
-      <w:r>
-        <w:t xml:space="preserve">:</w:t>
       </w:r>
     </w:p>
     <w:p>
@@ -16922,52 +17115,98 @@
         </w:numPr>
       </w:pPr>
       <w:r>
-        <w:t xml:space="preserve">The</w:t>
-      </w:r>
-      <w:r>
-        <w:t xml:space="preserve"> </w:t>
-      </w:r>
-      <w:r>
-        <w:rPr>
-          <w:rStyle w:val="VerbatimChar"/>
-        </w:rPr>
-        <w:t xml:space="preserve">db-init</w:t>
-      </w:r>
-      <w:r>
-        <w:t xml:space="preserve"> </w:t>
-      </w:r>
-      <w:r>
-        <w:t xml:space="preserve">container creates the</w:t>
-      </w:r>
-      <w:r>
-        <w:t xml:space="preserve"> </w:t>
-      </w:r>
-      <w:r>
-        <w:rPr>
-          <w:rStyle w:val="VerbatimChar"/>
-        </w:rPr>
-        <w:t xml:space="preserve">LavaRapido</w:t>
-      </w:r>
-      <w:r>
-        <w:t xml:space="preserve"> </w:t>
-      </w:r>
-      <w:r>
-        <w:t xml:space="preserve">database if it does not exist and sets it to the</w:t>
-      </w:r>
-      <w:r>
-        <w:t xml:space="preserve"> </w:t>
-      </w:r>
-      <w:r>
-        <w:rPr>
-          <w:rStyle w:val="VerbatimChar"/>
-        </w:rPr>
-        <w:t xml:space="preserve">SIMPLE</w:t>
-      </w:r>
-      <w:r>
-        <w:t xml:space="preserve"> </w:t>
-      </w:r>
-      <w:r>
-        <w:t xml:space="preserve">recovery model.</w:t>
+        <w:rPr>
+          <w:b/>
+          <w:bCs/>
+        </w:rPr>
+        <w:t xml:space="preserve">Password of the</w:t>
+      </w:r>
+      <w:r>
+        <w:rPr>
+          <w:b/>
+          <w:bCs/>
+        </w:rPr>
+        <w:t xml:space="preserve"> </w:t>
+      </w:r>
+      <w:r>
+        <w:rPr>
+          <w:rStyle w:val="VerbatimChar"/>
+          <w:b/>
+          <w:bCs/>
+        </w:rPr>
+        <w:t xml:space="preserve">admin</w:t>
+      </w:r>
+      <w:r>
+        <w:rPr>
+          <w:b/>
+          <w:bCs/>
+        </w:rPr>
+        <w:t xml:space="preserve"> </w:t>
+      </w:r>
+      <w:r>
+        <w:rPr>
+          <w:b/>
+          <w:bCs/>
+        </w:rPr>
+        <w:t xml:space="preserve">user:</w:t>
+      </w:r>
+      <w:r>
+        <w:t xml:space="preserve"> </w:t>
+      </w:r>
+      <w:r>
+        <w:t xml:space="preserve">it was generated during installation and is on the server, in</w:t>
+      </w:r>
+      <w:r>
+        <w:t xml:space="preserve"> </w:t>
+      </w:r>
+      <w:r>
+        <w:rPr>
+          <w:rStyle w:val="VerbatimChar"/>
+        </w:rPr>
+        <w:t xml:space="preserve">~/portainer-admin-password</w:t>
+      </w:r>
+      <w:r>
+        <w:t xml:space="preserve"> </w:t>
+      </w:r>
+      <w:r>
+        <w:t xml:space="preserve">(permissions</w:t>
+      </w:r>
+      <w:r>
+        <w:t xml:space="preserve"> </w:t>
+      </w:r>
+      <w:r>
+        <w:rPr>
+          <w:rStyle w:val="VerbatimChar"/>
+        </w:rPr>
+        <w:t xml:space="preserve">600</w:t>
+      </w:r>
+      <w:r>
+        <w:t xml:space="preserve">). It is read with</w:t>
+      </w:r>
+      <w:r>
+        <w:t xml:space="preserve"> </w:t>
+      </w:r>
+      <w:r>
+        <w:rPr>
+          <w:rStyle w:val="VerbatimChar"/>
+        </w:rPr>
+        <w:t xml:space="preserve">cat ~/portainer-admin-password</w:t>
+      </w:r>
+      <w:r>
+        <w:t xml:space="preserve"> </w:t>
+      </w:r>
+      <w:r>
+        <w:t xml:space="preserve">and can be changed from Portainer (</w:t>
+      </w:r>
+      <w:r>
+        <w:rPr>
+          <w:i/>
+          <w:iCs/>
+        </w:rPr>
+        <w:t xml:space="preserve">My account</w:t>
+      </w:r>
+      <w:r>
+        <w:t xml:space="preserve">).</w:t>
       </w:r>
     </w:p>
     <w:p>
@@ -16979,574 +17218,95 @@
         </w:numPr>
       </w:pPr>
       <w:r>
-        <w:t xml:space="preserve">The</w:t>
-      </w:r>
-      <w:r>
-        <w:t xml:space="preserve"> </w:t>
-      </w:r>
-      <w:r>
-        <w:rPr>
-          <w:rStyle w:val="VerbatimChar"/>
-        </w:rPr>
-        <w:t xml:space="preserve">payment-migrate</w:t>
-      </w:r>
-      <w:r>
-        <w:t xml:space="preserve"> </w:t>
-      </w:r>
-      <w:r>
-        <w:t xml:space="preserve">container (Liquibase 4.29) applies the payment-service changelogs (</w:t>
-      </w:r>
-      <w:r>
-        <w:rPr>
-          <w:rStyle w:val="VerbatimChar"/>
-        </w:rPr>
-        <w:t xml:space="preserve">db/changelog/db.changelog-master.yaml</w:t>
-      </w:r>
-      <w:r>
-        <w:t xml:space="preserve">) and exits.</w:t>
-      </w:r>
-    </w:p>
-    <w:p>
-      <w:pPr>
-        <w:pStyle w:val="Compact"/>
-        <w:numPr>
-          <w:ilvl w:val="0"/>
-          <w:numId w:val="1027"/>
-        </w:numPr>
-      </w:pPr>
-      <w:r>
-        <w:t xml:space="preserve">Each Java service applies its own changelogs on startup. Numbering is global: 001–041 plus the 1xx catalog seeds (040 of operations-service and 041 of notification-service are from 2026-10-21 and were applied on the server on 2026-10-22). In</w:t>
-      </w:r>
-      <w:r>
-        <w:t xml:space="preserve"> </w:t>
-      </w:r>
-      <w:r>
-        <w:rPr>
-          <w:rStyle w:val="VerbatimChar"/>
-        </w:rPr>
-        <w:t xml:space="preserve">develop</w:t>
-      </w:r>
-      <w:r>
-        <w:t xml:space="preserve"> </w:t>
-      </w:r>
-      <w:r>
-        <w:t xml:space="preserve">of 2026-10-23, 042 (operations-service, assignment notes) and 043 (booking-service, loyalty points per booking line) were added; they ship with</w:t>
-      </w:r>
-      <w:r>
-        <w:t xml:space="preserve"> </w:t>
-      </w:r>
-      <w:r>
-        <w:rPr>
-          <w:rStyle w:val="VerbatimChar"/>
-        </w:rPr>
-        <w:t xml:space="preserve">v1.1.0</w:t>
-      </w:r>
-      <w:r>
-        <w:t xml:space="preserve"> </w:t>
-      </w:r>
-      <w:r>
-        <w:t xml:space="preserve">together with payment-service's 021 (one promotion per booking); the next free one is 044.</w:t>
-      </w:r>
-    </w:p>
-    <w:p>
-      <w:pPr>
-        <w:pStyle w:val="Compact"/>
-        <w:numPr>
-          <w:ilvl w:val="0"/>
-          <w:numId w:val="1027"/>
-        </w:numPr>
-      </w:pPr>
-      <w:r>
-        <w:t xml:space="preserve">Hibernate only validates that the model matches the tables (</w:t>
-      </w:r>
-      <w:r>
-        <w:rPr>
-          <w:rStyle w:val="VerbatimChar"/>
-        </w:rPr>
-        <w:t xml:space="preserve">ddl-auto: validate</w:t>
-      </w:r>
-      <w:r>
-        <w:t xml:space="preserve">); it never alters tables.</w:t>
-      </w:r>
-    </w:p>
-    <w:p>
-      <w:pPr>
-        <w:pStyle w:val="FirstParagraph"/>
-      </w:pPr>
-      <w:r>
-        <w:t xml:space="preserve">Production</w:t>
-      </w:r>
-      <w:r>
-        <w:t xml:space="preserve"> </w:t>
-      </w:r>
-      <w:r>
-        <w:rPr>
+        <w:rPr>
+          <w:rStyle w:val="VerbatimChar"/>
           <w:b/>
           <w:bCs/>
         </w:rPr>
-        <w:t xml:space="preserve">does not load test data</w:t>
-      </w:r>
-      <w:r>
-        <w:t xml:space="preserve">: only catalogs (roles, services, statuses, schedule and business data).</w:t>
+        <w:t xml:space="preserve">local</w:t>
+      </w:r>
+      <w:r>
+        <w:rPr>
+          <w:b/>
+          <w:bCs/>
+        </w:rPr>
+        <w:t xml:space="preserve"> </w:t>
+      </w:r>
+      <w:r>
+        <w:rPr>
+          <w:b/>
+          <w:bCs/>
+        </w:rPr>
+        <w:t xml:space="preserve">environment:</w:t>
+      </w:r>
+      <w:r>
+        <w:t xml:space="preserve"> </w:t>
+      </w:r>
+      <w:r>
+        <w:t xml:space="preserve">registered on the Docker socket.</w:t>
+      </w:r>
+      <w:r>
+        <w:t xml:space="preserve"> </w:t>
+      </w:r>
+      <w:r>
+        <w:rPr>
+          <w:rStyle w:val="VerbatimChar"/>
+        </w:rPr>
+        <w:t xml:space="preserve">lavarapido</w:t>
+      </w:r>
+      <w:r>
+        <w:t xml:space="preserve"> </w:t>
+      </w:r>
+      <w:r>
+        <w:t xml:space="preserve">appears under</w:t>
+      </w:r>
+      <w:r>
+        <w:t xml:space="preserve"> </w:t>
+      </w:r>
+      <w:r>
+        <w:rPr>
+          <w:i/>
+          <w:iCs/>
+        </w:rPr>
+        <w:t xml:space="preserve">Containers</w:t>
+      </w:r>
+      <w:r>
+        <w:t xml:space="preserve"> </w:t>
+      </w:r>
+      <w:r>
+        <w:t xml:space="preserve">and</w:t>
+      </w:r>
+      <w:r>
+        <w:t xml:space="preserve"> </w:t>
+      </w:r>
+      <w:r>
+        <w:rPr>
+          <w:i/>
+          <w:iCs/>
+        </w:rPr>
+        <w:t xml:space="preserve">Stacks</w:t>
+      </w:r>
+      <w:r>
+        <w:t xml:space="preserve">.</w:t>
       </w:r>
     </w:p>
     <w:bookmarkEnd w:id="58"/>
-    <w:bookmarkStart w:id="59" w:name="X5ecb1b1fffa2f221d26c7012e6b10f2824f9171"/>
+    <w:bookmarkStart w:id="61" w:name="Xec87964eb7eea36b9bd79296133a88cceae8d4f"/>
+    <w:p>
+      <w:pPr>
+        <w:pStyle w:val="Heading3"/>
+      </w:pPr>
+      <w:r>
+        <w:t xml:space="preserve">4.2 Database Deployment and Migration</w:t>
+      </w:r>
+    </w:p>
+    <w:bookmarkStart w:id="59" w:name="X1c7abfdbfcfcf3845bb4ad74c832ceb28cc1f47"/>
     <w:p>
       <w:pPr>
         <w:pStyle w:val="Heading4"/>
       </w:pPr>
       <w:r>
-        <w:t xml:space="preserve">4.2.2 Verification of schema, index and user integrity</w:t>
-      </w:r>
-    </w:p>
-    <w:p>
-      <w:pPr>
-        <w:pStyle w:val="SourceCode"/>
-      </w:pPr>
-      <w:r>
-        <w:rPr>
-          <w:rStyle w:val="VariableTok"/>
-        </w:rPr>
-        <w:t xml:space="preserve">P</w:t>
-      </w:r>
-      <w:r>
-        <w:rPr>
-          <w:rStyle w:val="OperatorTok"/>
-        </w:rPr>
-        <w:t xml:space="preserve">=</w:t>
-      </w:r>
-      <w:r>
-        <w:rPr>
-          <w:rStyle w:val="VariableTok"/>
-        </w:rPr>
-        <w:t xml:space="preserve">$(</w:t>
-      </w:r>
-      <w:r>
-        <w:rPr>
-          <w:rStyle w:val="FunctionTok"/>
-        </w:rPr>
-        <w:t xml:space="preserve">grep</w:t>
-      </w:r>
-      <w:r>
-        <w:rPr>
-          <w:rStyle w:val="NormalTok"/>
-        </w:rPr>
-        <w:t xml:space="preserve"> </w:t>
-      </w:r>
-      <w:r>
-        <w:rPr>
-          <w:rStyle w:val="StringTok"/>
-        </w:rPr>
-        <w:t xml:space="preserve">'^DB_PASSWORD='</w:t>
-      </w:r>
-      <w:r>
-        <w:rPr>
-          <w:rStyle w:val="NormalTok"/>
-        </w:rPr>
-        <w:t xml:space="preserve"> .env.production </w:t>
-      </w:r>
-      <w:r>
-        <w:rPr>
-          <w:rStyle w:val="KeywordTok"/>
-        </w:rPr>
-        <w:t xml:space="preserve">|</w:t>
-      </w:r>
-      <w:r>
-        <w:rPr>
-          <w:rStyle w:val="NormalTok"/>
-        </w:rPr>
-        <w:t xml:space="preserve"> </w:t>
-      </w:r>
-      <w:r>
-        <w:rPr>
-          <w:rStyle w:val="FunctionTok"/>
-        </w:rPr>
-        <w:t xml:space="preserve">cut</w:t>
-      </w:r>
-      <w:r>
-        <w:rPr>
-          <w:rStyle w:val="NormalTok"/>
-        </w:rPr>
-        <w:t xml:space="preserve"> </w:t>
-      </w:r>
-      <w:r>
-        <w:rPr>
-          <w:rStyle w:val="AttributeTok"/>
-        </w:rPr>
-        <w:t xml:space="preserve">-d</w:t>
-      </w:r>
-      <w:r>
-        <w:rPr>
-          <w:rStyle w:val="OperatorTok"/>
-        </w:rPr>
-        <w:t xml:space="preserve">=</w:t>
-      </w:r>
-      <w:r>
-        <w:rPr>
-          <w:rStyle w:val="NormalTok"/>
-        </w:rPr>
-        <w:t xml:space="preserve"> </w:t>
-      </w:r>
-      <w:r>
-        <w:rPr>
-          <w:rStyle w:val="AttributeTok"/>
-        </w:rPr>
-        <w:t xml:space="preserve">-f2-</w:t>
-      </w:r>
-      <w:r>
-        <w:rPr>
-          <w:rStyle w:val="VariableTok"/>
-        </w:rPr>
-        <w:t xml:space="preserve">)</w:t>
-      </w:r>
-      <w:r>
-        <w:br/>
-      </w:r>
-      <w:r>
-        <w:rPr>
-          <w:rStyle w:val="FunctionTok"/>
-        </w:rPr>
-        <w:t xml:space="preserve">q()</w:t>
-      </w:r>
-      <w:r>
-        <w:rPr>
-          <w:rStyle w:val="KeywordTok"/>
-        </w:rPr>
-        <w:t xml:space="preserve">{</w:t>
-      </w:r>
-      <w:r>
-        <w:rPr>
-          <w:rStyle w:val="NormalTok"/>
-        </w:rPr>
-        <w:t xml:space="preserve"> </w:t>
-      </w:r>
-      <w:r>
-        <w:rPr>
-          <w:rStyle w:val="FunctionTok"/>
-        </w:rPr>
-        <w:t xml:space="preserve">sudo</w:t>
-      </w:r>
-      <w:r>
-        <w:rPr>
-          <w:rStyle w:val="NormalTok"/>
-        </w:rPr>
-        <w:t xml:space="preserve"> docker exec </w:t>
-      </w:r>
-      <w:r>
-        <w:rPr>
-          <w:rStyle w:val="AttributeTok"/>
-        </w:rPr>
-        <w:t xml:space="preserve">-e</w:t>
-      </w:r>
-      <w:r>
-        <w:rPr>
-          <w:rStyle w:val="NormalTok"/>
-        </w:rPr>
-        <w:t xml:space="preserve"> SQLCMDPASSWORD=</w:t>
-      </w:r>
-      <w:r>
-        <w:rPr>
-          <w:rStyle w:val="StringTok"/>
-        </w:rPr>
-        <w:t xml:space="preserve">"</w:t>
-      </w:r>
-      <w:r>
-        <w:rPr>
-          <w:rStyle w:val="VariableTok"/>
-        </w:rPr>
-        <w:t xml:space="preserve">$P</w:t>
-      </w:r>
-      <w:r>
-        <w:rPr>
-          <w:rStyle w:val="StringTok"/>
-        </w:rPr>
-        <w:t xml:space="preserve">"</w:t>
-      </w:r>
-      <w:r>
-        <w:rPr>
-          <w:rStyle w:val="NormalTok"/>
-        </w:rPr>
-        <w:t xml:space="preserve"> lavarapido-sqlserver /opt/mssql-tools18/bin/sqlcmd </w:t>
-      </w:r>
-      <w:r>
-        <w:rPr>
-          <w:rStyle w:val="DataTypeTok"/>
-        </w:rPr>
-        <w:t xml:space="preserve">\</w:t>
-      </w:r>
-      <w:r>
-        <w:br/>
-      </w:r>
-      <w:r>
-        <w:rPr>
-          <w:rStyle w:val="NormalTok"/>
-        </w:rPr>
-        <w:t xml:space="preserve">     </w:t>
-      </w:r>
-      <w:r>
-        <w:rPr>
-          <w:rStyle w:val="AttributeTok"/>
-        </w:rPr>
-        <w:t xml:space="preserve">-S</w:t>
-      </w:r>
-      <w:r>
-        <w:rPr>
-          <w:rStyle w:val="NormalTok"/>
-        </w:rPr>
-        <w:t xml:space="preserve"> localhost </w:t>
-      </w:r>
-      <w:r>
-        <w:rPr>
-          <w:rStyle w:val="AttributeTok"/>
-        </w:rPr>
-        <w:t xml:space="preserve">-U</w:t>
-      </w:r>
-      <w:r>
-        <w:rPr>
-          <w:rStyle w:val="NormalTok"/>
-        </w:rPr>
-        <w:t xml:space="preserve"> sa </w:t>
-      </w:r>
-      <w:r>
-        <w:rPr>
-          <w:rStyle w:val="AttributeTok"/>
-        </w:rPr>
-        <w:t xml:space="preserve">-C</w:t>
-      </w:r>
-      <w:r>
-        <w:rPr>
-          <w:rStyle w:val="NormalTok"/>
-        </w:rPr>
-        <w:t xml:space="preserve"> </w:t>
-      </w:r>
-      <w:r>
-        <w:rPr>
-          <w:rStyle w:val="AttributeTok"/>
-        </w:rPr>
-        <w:t xml:space="preserve">-d</w:t>
-      </w:r>
-      <w:r>
-        <w:rPr>
-          <w:rStyle w:val="NormalTok"/>
-        </w:rPr>
-        <w:t xml:space="preserve"> LavaRapido </w:t>
-      </w:r>
-      <w:r>
-        <w:rPr>
-          <w:rStyle w:val="AttributeTok"/>
-        </w:rPr>
-        <w:t xml:space="preserve">-Q</w:t>
-      </w:r>
-      <w:r>
-        <w:rPr>
-          <w:rStyle w:val="NormalTok"/>
-        </w:rPr>
-        <w:t xml:space="preserve"> </w:t>
-      </w:r>
-      <w:r>
-        <w:rPr>
-          <w:rStyle w:val="StringTok"/>
-        </w:rPr>
-        <w:t xml:space="preserve">"SET NOCOUNT ON; </w:t>
-      </w:r>
-      <w:r>
-        <w:rPr>
-          <w:rStyle w:val="VariableTok"/>
-        </w:rPr>
-        <w:t xml:space="preserve">$1</w:t>
-      </w:r>
-      <w:r>
-        <w:rPr>
-          <w:rStyle w:val="StringTok"/>
-        </w:rPr>
-        <w:t xml:space="preserve">"</w:t>
-      </w:r>
-      <w:r>
-        <w:rPr>
-          <w:rStyle w:val="KeywordTok"/>
-        </w:rPr>
-        <w:t xml:space="preserve">;</w:t>
-      </w:r>
-      <w:r>
-        <w:rPr>
-          <w:rStyle w:val="NormalTok"/>
-        </w:rPr>
-        <w:t xml:space="preserve"> </w:t>
-      </w:r>
-      <w:r>
-        <w:rPr>
-          <w:rStyle w:val="KeywordTok"/>
-        </w:rPr>
-        <w:t xml:space="preserve">}</w:t>
-      </w:r>
-      <w:r>
-        <w:br/>
-      </w:r>
-      <w:r>
-        <w:rPr>
-          <w:rStyle w:val="ExtensionTok"/>
-        </w:rPr>
-        <w:t xml:space="preserve">q</w:t>
-      </w:r>
-      <w:r>
-        <w:rPr>
-          <w:rStyle w:val="NormalTok"/>
-        </w:rPr>
-        <w:t xml:space="preserve"> </w:t>
-      </w:r>
-      <w:r>
-        <w:rPr>
-          <w:rStyle w:val="StringTok"/>
-        </w:rPr>
-        <w:t xml:space="preserve">"SELECT s.name AS esquema, COUNT(t.name) AS tablas FROM sys.schemas s JOIN sys.tables t ON t.schema_id=s.schema_id GROUP BY s.name"</w:t>
-      </w:r>
-      <w:r>
-        <w:br/>
-      </w:r>
-      <w:r>
-        <w:rPr>
-          <w:rStyle w:val="ControlFlowTok"/>
-        </w:rPr>
-        <w:t xml:space="preserve">for</w:t>
-      </w:r>
-      <w:r>
-        <w:rPr>
-          <w:rStyle w:val="NormalTok"/>
-        </w:rPr>
-        <w:t xml:space="preserve"> s </w:t>
-      </w:r>
-      <w:r>
-        <w:rPr>
-          <w:rStyle w:val="KeywordTok"/>
-        </w:rPr>
-        <w:t xml:space="preserve">in</w:t>
-      </w:r>
-      <w:r>
-        <w:rPr>
-          <w:rStyle w:val="NormalTok"/>
-        </w:rPr>
-        <w:t xml:space="preserve"> SECURITY CUSTOMER BOOKING OPERATIONS NOTIFICATION PAYMENT</w:t>
-      </w:r>
-      <w:r>
-        <w:rPr>
-          <w:rStyle w:val="KeywordTok"/>
-        </w:rPr>
-        <w:t xml:space="preserve">;</w:t>
-      </w:r>
-      <w:r>
-        <w:rPr>
-          <w:rStyle w:val="NormalTok"/>
-        </w:rPr>
-        <w:t xml:space="preserve"> </w:t>
-      </w:r>
-      <w:r>
-        <w:rPr>
-          <w:rStyle w:val="ControlFlowTok"/>
-        </w:rPr>
-        <w:t xml:space="preserve">do</w:t>
-      </w:r>
-      <w:r>
-        <w:br/>
-      </w:r>
-      <w:r>
-        <w:rPr>
-          <w:rStyle w:val="NormalTok"/>
-        </w:rPr>
-        <w:t xml:space="preserve">  </w:t>
-      </w:r>
-      <w:r>
-        <w:rPr>
-          <w:rStyle w:val="ExtensionTok"/>
-        </w:rPr>
-        <w:t xml:space="preserve">q</w:t>
-      </w:r>
-      <w:r>
-        <w:rPr>
-          <w:rStyle w:val="NormalTok"/>
-        </w:rPr>
-        <w:t xml:space="preserve"> </w:t>
-      </w:r>
-      <w:r>
-        <w:rPr>
-          <w:rStyle w:val="StringTok"/>
-        </w:rPr>
-        <w:t xml:space="preserve">"SELECT '</w:t>
-      </w:r>
-      <w:r>
-        <w:rPr>
-          <w:rStyle w:val="VariableTok"/>
-        </w:rPr>
-        <w:t xml:space="preserve">$s</w:t>
-      </w:r>
-      <w:r>
-        <w:rPr>
-          <w:rStyle w:val="StringTok"/>
-        </w:rPr>
-        <w:t xml:space="preserve">' AS servicio, COUNT(*) AS changesets, SUM(CASE WHEN EXECTYPE IN ('EXECUTED','MARK_RAN') THEN 1 ELSE 0 END) AS ok FROM DATABASECHANGELOG_</w:t>
-      </w:r>
-      <w:r>
-        <w:rPr>
-          <w:rStyle w:val="VariableTok"/>
-        </w:rPr>
-        <w:t xml:space="preserve">$s</w:t>
-      </w:r>
-      <w:r>
-        <w:rPr>
-          <w:rStyle w:val="StringTok"/>
-        </w:rPr>
-        <w:t xml:space="preserve">"</w:t>
-      </w:r>
-      <w:r>
-        <w:br/>
-      </w:r>
-      <w:r>
-        <w:rPr>
-          <w:rStyle w:val="ControlFlowTok"/>
-        </w:rPr>
-        <w:t xml:space="preserve">done</w:t>
-      </w:r>
-      <w:r>
-        <w:br/>
-      </w:r>
-      <w:r>
-        <w:rPr>
-          <w:rStyle w:val="ExtensionTok"/>
-        </w:rPr>
-        <w:t xml:space="preserve">q</w:t>
-      </w:r>
-      <w:r>
-        <w:rPr>
-          <w:rStyle w:val="NormalTok"/>
-        </w:rPr>
-        <w:t xml:space="preserve"> </w:t>
-      </w:r>
-      <w:r>
-        <w:rPr>
-          <w:rStyle w:val="StringTok"/>
-        </w:rPr>
-        <w:t xml:space="preserve">"SELECT COUNT(*) AS indices FROM sys.indexes WHERE object_id IN (SELECT object_id FROM sys.tables)"</w:t>
-      </w:r>
-      <w:r>
-        <w:br/>
-      </w:r>
-      <w:r>
-        <w:rPr>
-          <w:rStyle w:val="ExtensionTok"/>
-        </w:rPr>
-        <w:t xml:space="preserve">q</w:t>
-      </w:r>
-      <w:r>
-        <w:rPr>
-          <w:rStyle w:val="NormalTok"/>
-        </w:rPr>
-        <w:t xml:space="preserve"> </w:t>
-      </w:r>
-      <w:r>
-        <w:rPr>
-          <w:rStyle w:val="StringTok"/>
-        </w:rPr>
-        <w:t xml:space="preserve">"SELECT u.username, r.code FROM security.app_user u JOIN security.user_role ur ON ur.user_id=u.user_id JOIN security.role r ON r.role_id=ur.role_id WHERE r.code='ADMIN'"</w:t>
+        <w:t xml:space="preserve">4.2.1 Running DDL/DML scripts or migration tools (Liquibase)</w:t>
       </w:r>
     </w:p>
     <w:p>
@@ -17554,7 +17314,20 @@
         <w:pStyle w:val="FirstParagraph"/>
       </w:pPr>
       <w:r>
-        <w:t xml:space="preserve">Expected result:</w:t>
+        <w:t xml:space="preserve">Migrations are</w:t>
+      </w:r>
+      <w:r>
+        <w:t xml:space="preserve"> </w:t>
+      </w:r>
+      <w:r>
+        <w:rPr>
+          <w:b/>
+          <w:bCs/>
+        </w:rPr>
+        <w:t xml:space="preserve">automatic</w:t>
+      </w:r>
+      <w:r>
+        <w:t xml:space="preserve">:</w:t>
       </w:r>
     </w:p>
     <w:p>
@@ -17566,7 +17339,52 @@
         </w:numPr>
       </w:pPr>
       <w:r>
-        <w:t xml:space="preserve">the 9 schemas with their tables;</w:t>
+        <w:t xml:space="preserve">The</w:t>
+      </w:r>
+      <w:r>
+        <w:t xml:space="preserve"> </w:t>
+      </w:r>
+      <w:r>
+        <w:rPr>
+          <w:rStyle w:val="VerbatimChar"/>
+        </w:rPr>
+        <w:t xml:space="preserve">db-init</w:t>
+      </w:r>
+      <w:r>
+        <w:t xml:space="preserve"> </w:t>
+      </w:r>
+      <w:r>
+        <w:t xml:space="preserve">container creates the</w:t>
+      </w:r>
+      <w:r>
+        <w:t xml:space="preserve"> </w:t>
+      </w:r>
+      <w:r>
+        <w:rPr>
+          <w:rStyle w:val="VerbatimChar"/>
+        </w:rPr>
+        <w:t xml:space="preserve">LavaRapido</w:t>
+      </w:r>
+      <w:r>
+        <w:t xml:space="preserve"> </w:t>
+      </w:r>
+      <w:r>
+        <w:t xml:space="preserve">database if it does not exist and sets it to the</w:t>
+      </w:r>
+      <w:r>
+        <w:t xml:space="preserve"> </w:t>
+      </w:r>
+      <w:r>
+        <w:rPr>
+          <w:rStyle w:val="VerbatimChar"/>
+        </w:rPr>
+        <w:t xml:space="preserve">SIMPLE</w:t>
+      </w:r>
+      <w:r>
+        <w:t xml:space="preserve"> </w:t>
+      </w:r>
+      <w:r>
+        <w:t xml:space="preserve">recovery model.</w:t>
       </w:r>
     </w:p>
     <w:p>
@@ -17578,64 +17396,31 @@
         </w:numPr>
       </w:pPr>
       <w:r>
-        <w:t xml:space="preserve">in each service,</w:t>
-      </w:r>
-      <w:r>
-        <w:t xml:space="preserve"> </w:t>
-      </w:r>
-      <w:r>
-        <w:rPr>
-          <w:rStyle w:val="VerbatimChar"/>
-        </w:rPr>
-        <w:t xml:space="preserve">ok</w:t>
-      </w:r>
-      <w:r>
-        <w:t xml:space="preserve"> </w:t>
-      </w:r>
-      <w:r>
-        <w:t xml:space="preserve">equal to</w:t>
-      </w:r>
-      <w:r>
-        <w:t xml:space="preserve"> </w:t>
-      </w:r>
-      <w:r>
-        <w:rPr>
-          <w:rStyle w:val="VerbatimChar"/>
-        </w:rPr>
-        <w:t xml:space="preserve">changesets</w:t>
-      </w:r>
-      <w:r>
-        <w:t xml:space="preserve"> </w:t>
-      </w:r>
-      <w:r>
-        <w:t xml:space="preserve">(2026-10-16: 143 of 143; 2026-10-19: 144 of 144, with 039); since 2026-10-22, 040 also appears in</w:t>
-      </w:r>
-      <w:r>
-        <w:t xml:space="preserve"> </w:t>
-      </w:r>
-      <w:r>
-        <w:rPr>
-          <w:rStyle w:val="VerbatimChar"/>
-        </w:rPr>
-        <w:t xml:space="preserve">DATABASECHANGELOG_OPERATIONS</w:t>
-      </w:r>
-      <w:r>
-        <w:t xml:space="preserve"> </w:t>
-      </w:r>
-      <w:r>
-        <w:t xml:space="preserve">and 041 in</w:t>
-      </w:r>
-      <w:r>
-        <w:t xml:space="preserve"> </w:t>
-      </w:r>
-      <w:r>
-        <w:rPr>
-          <w:rStyle w:val="VerbatimChar"/>
-        </w:rPr>
-        <w:t xml:space="preserve">DATABASECHANGELOG_NOTIFICATION</w:t>
-      </w:r>
-      <w:r>
-        <w:t xml:space="preserve">;</w:t>
+        <w:t xml:space="preserve">The</w:t>
+      </w:r>
+      <w:r>
+        <w:t xml:space="preserve"> </w:t>
+      </w:r>
+      <w:r>
+        <w:rPr>
+          <w:rStyle w:val="VerbatimChar"/>
+        </w:rPr>
+        <w:t xml:space="preserve">payment-migrate</w:t>
+      </w:r>
+      <w:r>
+        <w:t xml:space="preserve"> </w:t>
+      </w:r>
+      <w:r>
+        <w:t xml:space="preserve">container (Liquibase 4.29) applies the payment-service changelogs (</w:t>
+      </w:r>
+      <w:r>
+        <w:rPr>
+          <w:rStyle w:val="VerbatimChar"/>
+        </w:rPr>
+        <w:t xml:space="preserve">db/changelog/db.changelog-master.yaml</w:t>
+      </w:r>
+      <w:r>
+        <w:t xml:space="preserve">) and exits.</w:t>
       </w:r>
     </w:p>
     <w:p>
@@ -17647,39 +17432,538 @@
         </w:numPr>
       </w:pPr>
       <w:r>
-        <w:t xml:space="preserve">the initial administrator created (security log:</w:t>
-      </w:r>
-      <w:r>
-        <w:t xml:space="preserve"> </w:t>
-      </w:r>
-      <w:r>
-        <w:rPr>
-          <w:rStyle w:val="VerbatimChar"/>
-        </w:rPr>
-        <w:t xml:space="preserve">First administrator created</w:t>
-      </w:r>
-      <w:r>
-        <w:t xml:space="preserve">).</w:t>
+        <w:t xml:space="preserve">Each Java service applies its own changelogs on startup. Numbering is global: 001–041 plus the 1xx catalog seeds (040 of operations-service and 041 of notification-service are from 2026-10-21 and were applied on the server on 2026-10-22). In</w:t>
+      </w:r>
+      <w:r>
+        <w:t xml:space="preserve"> </w:t>
+      </w:r>
+      <w:r>
+        <w:rPr>
+          <w:rStyle w:val="VerbatimChar"/>
+        </w:rPr>
+        <w:t xml:space="preserve">develop</w:t>
+      </w:r>
+      <w:r>
+        <w:t xml:space="preserve"> </w:t>
+      </w:r>
+      <w:r>
+        <w:t xml:space="preserve">of 2026-10-23, 042 (operations-service, assignment notes) and 043 (booking-service, loyalty points per booking line) were added; they ship with</w:t>
+      </w:r>
+      <w:r>
+        <w:t xml:space="preserve"> </w:t>
+      </w:r>
+      <w:r>
+        <w:rPr>
+          <w:rStyle w:val="VerbatimChar"/>
+        </w:rPr>
+        <w:t xml:space="preserve">v1.1.0</w:t>
+      </w:r>
+      <w:r>
+        <w:t xml:space="preserve"> </w:t>
+      </w:r>
+      <w:r>
+        <w:t xml:space="preserve">together with payment-service's 021 (one promotion per booking); the next free one is 044.</w:t>
+      </w:r>
+    </w:p>
+    <w:p>
+      <w:pPr>
+        <w:pStyle w:val="Compact"/>
+        <w:numPr>
+          <w:ilvl w:val="0"/>
+          <w:numId w:val="1028"/>
+        </w:numPr>
+      </w:pPr>
+      <w:r>
+        <w:t xml:space="preserve">Hibernate only validates that the model matches the tables (</w:t>
+      </w:r>
+      <w:r>
+        <w:rPr>
+          <w:rStyle w:val="VerbatimChar"/>
+        </w:rPr>
+        <w:t xml:space="preserve">ddl-auto: validate</w:t>
+      </w:r>
+      <w:r>
+        <w:t xml:space="preserve">); it never alters tables.</w:t>
+      </w:r>
+    </w:p>
+    <w:p>
+      <w:pPr>
+        <w:pStyle w:val="FirstParagraph"/>
+      </w:pPr>
+      <w:r>
+        <w:t xml:space="preserve">Production</w:t>
+      </w:r>
+      <w:r>
+        <w:t xml:space="preserve"> </w:t>
+      </w:r>
+      <w:r>
+        <w:rPr>
+          <w:b/>
+          <w:bCs/>
+        </w:rPr>
+        <w:t xml:space="preserve">does not load test data</w:t>
+      </w:r>
+      <w:r>
+        <w:t xml:space="preserve">: only catalogs (roles, services, statuses, schedule and business data).</w:t>
       </w:r>
     </w:p>
     <w:bookmarkEnd w:id="59"/>
-    <w:bookmarkEnd w:id="60"/>
-    <w:bookmarkStart w:id="65" w:name="X7005f183192c0821308cfbcb7aaaff2714f1b27"/>
-    <w:p>
-      <w:pPr>
-        <w:pStyle w:val="Heading3"/>
-      </w:pPr>
-      <w:r>
-        <w:t xml:space="preserve">4.3 Application Stack Deployment and Orchestration</w:t>
-      </w:r>
-    </w:p>
-    <w:bookmarkStart w:id="61" w:name="X35bcd2e0f3203d2678b4d8bbc2703cb98290b05"/>
+    <w:bookmarkStart w:id="60" w:name="X5ecb1b1fffa2f221d26c7012e6b10f2824f9171"/>
     <w:p>
       <w:pPr>
         <w:pStyle w:val="Heading4"/>
       </w:pPr>
       <w:r>
-        <w:t xml:space="preserve">4.3.1 Loading the docker-compose.yml file in Portainer</w:t>
+        <w:t xml:space="preserve">4.2.2 Verification of schema, index and user integrity</w:t>
+      </w:r>
+    </w:p>
+    <w:p>
+      <w:pPr>
+        <w:pStyle w:val="SourceCode"/>
+      </w:pPr>
+      <w:r>
+        <w:rPr>
+          <w:rStyle w:val="VariableTok"/>
+        </w:rPr>
+        <w:t xml:space="preserve">P</w:t>
+      </w:r>
+      <w:r>
+        <w:rPr>
+          <w:rStyle w:val="OperatorTok"/>
+        </w:rPr>
+        <w:t xml:space="preserve">=</w:t>
+      </w:r>
+      <w:r>
+        <w:rPr>
+          <w:rStyle w:val="VariableTok"/>
+        </w:rPr>
+        <w:t xml:space="preserve">$(</w:t>
+      </w:r>
+      <w:r>
+        <w:rPr>
+          <w:rStyle w:val="FunctionTok"/>
+        </w:rPr>
+        <w:t xml:space="preserve">grep</w:t>
+      </w:r>
+      <w:r>
+        <w:rPr>
+          <w:rStyle w:val="NormalTok"/>
+        </w:rPr>
+        <w:t xml:space="preserve"> </w:t>
+      </w:r>
+      <w:r>
+        <w:rPr>
+          <w:rStyle w:val="StringTok"/>
+        </w:rPr>
+        <w:t xml:space="preserve">'^DB_PASSWORD='</w:t>
+      </w:r>
+      <w:r>
+        <w:rPr>
+          <w:rStyle w:val="NormalTok"/>
+        </w:rPr>
+        <w:t xml:space="preserve"> .env.production </w:t>
+      </w:r>
+      <w:r>
+        <w:rPr>
+          <w:rStyle w:val="KeywordTok"/>
+        </w:rPr>
+        <w:t xml:space="preserve">|</w:t>
+      </w:r>
+      <w:r>
+        <w:rPr>
+          <w:rStyle w:val="NormalTok"/>
+        </w:rPr>
+        <w:t xml:space="preserve"> </w:t>
+      </w:r>
+      <w:r>
+        <w:rPr>
+          <w:rStyle w:val="FunctionTok"/>
+        </w:rPr>
+        <w:t xml:space="preserve">cut</w:t>
+      </w:r>
+      <w:r>
+        <w:rPr>
+          <w:rStyle w:val="NormalTok"/>
+        </w:rPr>
+        <w:t xml:space="preserve"> </w:t>
+      </w:r>
+      <w:r>
+        <w:rPr>
+          <w:rStyle w:val="AttributeTok"/>
+        </w:rPr>
+        <w:t xml:space="preserve">-d</w:t>
+      </w:r>
+      <w:r>
+        <w:rPr>
+          <w:rStyle w:val="OperatorTok"/>
+        </w:rPr>
+        <w:t xml:space="preserve">=</w:t>
+      </w:r>
+      <w:r>
+        <w:rPr>
+          <w:rStyle w:val="NormalTok"/>
+        </w:rPr>
+        <w:t xml:space="preserve"> </w:t>
+      </w:r>
+      <w:r>
+        <w:rPr>
+          <w:rStyle w:val="AttributeTok"/>
+        </w:rPr>
+        <w:t xml:space="preserve">-f2-</w:t>
+      </w:r>
+      <w:r>
+        <w:rPr>
+          <w:rStyle w:val="VariableTok"/>
+        </w:rPr>
+        <w:t xml:space="preserve">)</w:t>
+      </w:r>
+      <w:r>
+        <w:br/>
+      </w:r>
+      <w:r>
+        <w:rPr>
+          <w:rStyle w:val="FunctionTok"/>
+        </w:rPr>
+        <w:t xml:space="preserve">q()</w:t>
+      </w:r>
+      <w:r>
+        <w:rPr>
+          <w:rStyle w:val="KeywordTok"/>
+        </w:rPr>
+        <w:t xml:space="preserve">{</w:t>
+      </w:r>
+      <w:r>
+        <w:rPr>
+          <w:rStyle w:val="NormalTok"/>
+        </w:rPr>
+        <w:t xml:space="preserve"> </w:t>
+      </w:r>
+      <w:r>
+        <w:rPr>
+          <w:rStyle w:val="FunctionTok"/>
+        </w:rPr>
+        <w:t xml:space="preserve">sudo</w:t>
+      </w:r>
+      <w:r>
+        <w:rPr>
+          <w:rStyle w:val="NormalTok"/>
+        </w:rPr>
+        <w:t xml:space="preserve"> docker exec </w:t>
+      </w:r>
+      <w:r>
+        <w:rPr>
+          <w:rStyle w:val="AttributeTok"/>
+        </w:rPr>
+        <w:t xml:space="preserve">-e</w:t>
+      </w:r>
+      <w:r>
+        <w:rPr>
+          <w:rStyle w:val="NormalTok"/>
+        </w:rPr>
+        <w:t xml:space="preserve"> SQLCMDPASSWORD=</w:t>
+      </w:r>
+      <w:r>
+        <w:rPr>
+          <w:rStyle w:val="StringTok"/>
+        </w:rPr>
+        <w:t xml:space="preserve">"</w:t>
+      </w:r>
+      <w:r>
+        <w:rPr>
+          <w:rStyle w:val="VariableTok"/>
+        </w:rPr>
+        <w:t xml:space="preserve">$P</w:t>
+      </w:r>
+      <w:r>
+        <w:rPr>
+          <w:rStyle w:val="StringTok"/>
+        </w:rPr>
+        <w:t xml:space="preserve">"</w:t>
+      </w:r>
+      <w:r>
+        <w:rPr>
+          <w:rStyle w:val="NormalTok"/>
+        </w:rPr>
+        <w:t xml:space="preserve"> lavarapido-sqlserver /opt/mssql-tools18/bin/sqlcmd </w:t>
+      </w:r>
+      <w:r>
+        <w:rPr>
+          <w:rStyle w:val="DataTypeTok"/>
+        </w:rPr>
+        <w:t xml:space="preserve">\</w:t>
+      </w:r>
+      <w:r>
+        <w:br/>
+      </w:r>
+      <w:r>
+        <w:rPr>
+          <w:rStyle w:val="NormalTok"/>
+        </w:rPr>
+        <w:t xml:space="preserve">     </w:t>
+      </w:r>
+      <w:r>
+        <w:rPr>
+          <w:rStyle w:val="AttributeTok"/>
+        </w:rPr>
+        <w:t xml:space="preserve">-S</w:t>
+      </w:r>
+      <w:r>
+        <w:rPr>
+          <w:rStyle w:val="NormalTok"/>
+        </w:rPr>
+        <w:t xml:space="preserve"> localhost </w:t>
+      </w:r>
+      <w:r>
+        <w:rPr>
+          <w:rStyle w:val="AttributeTok"/>
+        </w:rPr>
+        <w:t xml:space="preserve">-U</w:t>
+      </w:r>
+      <w:r>
+        <w:rPr>
+          <w:rStyle w:val="NormalTok"/>
+        </w:rPr>
+        <w:t xml:space="preserve"> sa </w:t>
+      </w:r>
+      <w:r>
+        <w:rPr>
+          <w:rStyle w:val="AttributeTok"/>
+        </w:rPr>
+        <w:t xml:space="preserve">-C</w:t>
+      </w:r>
+      <w:r>
+        <w:rPr>
+          <w:rStyle w:val="NormalTok"/>
+        </w:rPr>
+        <w:t xml:space="preserve"> </w:t>
+      </w:r>
+      <w:r>
+        <w:rPr>
+          <w:rStyle w:val="AttributeTok"/>
+        </w:rPr>
+        <w:t xml:space="preserve">-d</w:t>
+      </w:r>
+      <w:r>
+        <w:rPr>
+          <w:rStyle w:val="NormalTok"/>
+        </w:rPr>
+        <w:t xml:space="preserve"> LavaRapido </w:t>
+      </w:r>
+      <w:r>
+        <w:rPr>
+          <w:rStyle w:val="AttributeTok"/>
+        </w:rPr>
+        <w:t xml:space="preserve">-Q</w:t>
+      </w:r>
+      <w:r>
+        <w:rPr>
+          <w:rStyle w:val="NormalTok"/>
+        </w:rPr>
+        <w:t xml:space="preserve"> </w:t>
+      </w:r>
+      <w:r>
+        <w:rPr>
+          <w:rStyle w:val="StringTok"/>
+        </w:rPr>
+        <w:t xml:space="preserve">"SET NOCOUNT ON; </w:t>
+      </w:r>
+      <w:r>
+        <w:rPr>
+          <w:rStyle w:val="VariableTok"/>
+        </w:rPr>
+        <w:t xml:space="preserve">$1</w:t>
+      </w:r>
+      <w:r>
+        <w:rPr>
+          <w:rStyle w:val="StringTok"/>
+        </w:rPr>
+        <w:t xml:space="preserve">"</w:t>
+      </w:r>
+      <w:r>
+        <w:rPr>
+          <w:rStyle w:val="KeywordTok"/>
+        </w:rPr>
+        <w:t xml:space="preserve">;</w:t>
+      </w:r>
+      <w:r>
+        <w:rPr>
+          <w:rStyle w:val="NormalTok"/>
+        </w:rPr>
+        <w:t xml:space="preserve"> </w:t>
+      </w:r>
+      <w:r>
+        <w:rPr>
+          <w:rStyle w:val="KeywordTok"/>
+        </w:rPr>
+        <w:t xml:space="preserve">}</w:t>
+      </w:r>
+      <w:r>
+        <w:br/>
+      </w:r>
+      <w:r>
+        <w:rPr>
+          <w:rStyle w:val="ExtensionTok"/>
+        </w:rPr>
+        <w:t xml:space="preserve">q</w:t>
+      </w:r>
+      <w:r>
+        <w:rPr>
+          <w:rStyle w:val="NormalTok"/>
+        </w:rPr>
+        <w:t xml:space="preserve"> </w:t>
+      </w:r>
+      <w:r>
+        <w:rPr>
+          <w:rStyle w:val="StringTok"/>
+        </w:rPr>
+        <w:t xml:space="preserve">"SELECT s.name AS esquema, COUNT(t.name) AS tablas FROM sys.schemas s JOIN sys.tables t ON t.schema_id=s.schema_id GROUP BY s.name"</w:t>
+      </w:r>
+      <w:r>
+        <w:br/>
+      </w:r>
+      <w:r>
+        <w:rPr>
+          <w:rStyle w:val="ControlFlowTok"/>
+        </w:rPr>
+        <w:t xml:space="preserve">for</w:t>
+      </w:r>
+      <w:r>
+        <w:rPr>
+          <w:rStyle w:val="NormalTok"/>
+        </w:rPr>
+        <w:t xml:space="preserve"> s </w:t>
+      </w:r>
+      <w:r>
+        <w:rPr>
+          <w:rStyle w:val="KeywordTok"/>
+        </w:rPr>
+        <w:t xml:space="preserve">in</w:t>
+      </w:r>
+      <w:r>
+        <w:rPr>
+          <w:rStyle w:val="NormalTok"/>
+        </w:rPr>
+        <w:t xml:space="preserve"> SECURITY CUSTOMER BOOKING OPERATIONS NOTIFICATION PAYMENT</w:t>
+      </w:r>
+      <w:r>
+        <w:rPr>
+          <w:rStyle w:val="KeywordTok"/>
+        </w:rPr>
+        <w:t xml:space="preserve">;</w:t>
+      </w:r>
+      <w:r>
+        <w:rPr>
+          <w:rStyle w:val="NormalTok"/>
+        </w:rPr>
+        <w:t xml:space="preserve"> </w:t>
+      </w:r>
+      <w:r>
+        <w:rPr>
+          <w:rStyle w:val="ControlFlowTok"/>
+        </w:rPr>
+        <w:t xml:space="preserve">do</w:t>
+      </w:r>
+      <w:r>
+        <w:br/>
+      </w:r>
+      <w:r>
+        <w:rPr>
+          <w:rStyle w:val="NormalTok"/>
+        </w:rPr>
+        <w:t xml:space="preserve">  </w:t>
+      </w:r>
+      <w:r>
+        <w:rPr>
+          <w:rStyle w:val="ExtensionTok"/>
+        </w:rPr>
+        <w:t xml:space="preserve">q</w:t>
+      </w:r>
+      <w:r>
+        <w:rPr>
+          <w:rStyle w:val="NormalTok"/>
+        </w:rPr>
+        <w:t xml:space="preserve"> </w:t>
+      </w:r>
+      <w:r>
+        <w:rPr>
+          <w:rStyle w:val="StringTok"/>
+        </w:rPr>
+        <w:t xml:space="preserve">"SELECT '</w:t>
+      </w:r>
+      <w:r>
+        <w:rPr>
+          <w:rStyle w:val="VariableTok"/>
+        </w:rPr>
+        <w:t xml:space="preserve">$s</w:t>
+      </w:r>
+      <w:r>
+        <w:rPr>
+          <w:rStyle w:val="StringTok"/>
+        </w:rPr>
+        <w:t xml:space="preserve">' AS servicio, COUNT(*) AS changesets, SUM(CASE WHEN EXECTYPE IN ('EXECUTED','MARK_RAN') THEN 1 ELSE 0 END) AS ok FROM DATABASECHANGELOG_</w:t>
+      </w:r>
+      <w:r>
+        <w:rPr>
+          <w:rStyle w:val="VariableTok"/>
+        </w:rPr>
+        <w:t xml:space="preserve">$s</w:t>
+      </w:r>
+      <w:r>
+        <w:rPr>
+          <w:rStyle w:val="StringTok"/>
+        </w:rPr>
+        <w:t xml:space="preserve">"</w:t>
+      </w:r>
+      <w:r>
+        <w:br/>
+      </w:r>
+      <w:r>
+        <w:rPr>
+          <w:rStyle w:val="ControlFlowTok"/>
+        </w:rPr>
+        <w:t xml:space="preserve">done</w:t>
+      </w:r>
+      <w:r>
+        <w:br/>
+      </w:r>
+      <w:r>
+        <w:rPr>
+          <w:rStyle w:val="ExtensionTok"/>
+        </w:rPr>
+        <w:t xml:space="preserve">q</w:t>
+      </w:r>
+      <w:r>
+        <w:rPr>
+          <w:rStyle w:val="NormalTok"/>
+        </w:rPr>
+        <w:t xml:space="preserve"> </w:t>
+      </w:r>
+      <w:r>
+        <w:rPr>
+          <w:rStyle w:val="StringTok"/>
+        </w:rPr>
+        <w:t xml:space="preserve">"SELECT COUNT(*) AS indices FROM sys.indexes WHERE object_id IN (SELECT object_id FROM sys.tables)"</w:t>
+      </w:r>
+      <w:r>
+        <w:br/>
+      </w:r>
+      <w:r>
+        <w:rPr>
+          <w:rStyle w:val="ExtensionTok"/>
+        </w:rPr>
+        <w:t xml:space="preserve">q</w:t>
+      </w:r>
+      <w:r>
+        <w:rPr>
+          <w:rStyle w:val="NormalTok"/>
+        </w:rPr>
+        <w:t xml:space="preserve"> </w:t>
+      </w:r>
+      <w:r>
+        <w:rPr>
+          <w:rStyle w:val="StringTok"/>
+        </w:rPr>
+        <w:t xml:space="preserve">"SELECT u.username, r.code FROM security.app_user u JOIN security.user_role ur ON ur.user_id=u.user_id JOIN security.role r ON r.role_id=ur.role_id WHERE r.code='ADMIN'"</w:t>
       </w:r>
     </w:p>
     <w:p>
@@ -17687,19 +17971,7 @@
         <w:pStyle w:val="FirstParagraph"/>
       </w:pPr>
       <w:r>
-        <w:t xml:space="preserve">The stack is defined with two files versioned in</w:t>
-      </w:r>
-      <w:r>
-        <w:t xml:space="preserve"> </w:t>
-      </w:r>
-      <w:r>
-        <w:rPr>
-          <w:rStyle w:val="VerbatimChar"/>
-        </w:rPr>
-        <w:t xml:space="preserve">lavarapido-infra</w:t>
-      </w:r>
-      <w:r>
-        <w:t xml:space="preserve">:</w:t>
+        <w:t xml:space="preserve">Expected result:</w:t>
       </w:r>
     </w:p>
     <w:p>
@@ -17711,25 +17983,7 @@
         </w:numPr>
       </w:pPr>
       <w:r>
-        <w:rPr>
-          <w:rStyle w:val="VerbatimChar"/>
-          <w:b/>
-          <w:bCs/>
-        </w:rPr>
-        <w:t xml:space="preserve">docker-compose.yml</w:t>
-      </w:r>
-      <w:r>
-        <w:rPr>
-          <w:b/>
-          <w:bCs/>
-        </w:rPr>
-        <w:t xml:space="preserve">:</w:t>
-      </w:r>
-      <w:r>
-        <w:t xml:space="preserve"> </w:t>
-      </w:r>
-      <w:r>
-        <w:t xml:space="preserve">the base, the same as in development.</w:t>
+        <w:t xml:space="preserve">the 9 schemas with their tables;</w:t>
       </w:r>
     </w:p>
     <w:p>
@@ -17741,324 +17995,128 @@
         </w:numPr>
       </w:pPr>
       <w:r>
-        <w:rPr>
-          <w:rStyle w:val="VerbatimChar"/>
-          <w:b/>
-          <w:bCs/>
-        </w:rPr>
-        <w:t xml:space="preserve">docker-compose.prod.yml</w:t>
-      </w:r>
-      <w:r>
-        <w:rPr>
-          <w:b/>
-          <w:bCs/>
-        </w:rPr>
+        <w:t xml:space="preserve">in each service,</w:t>
+      </w:r>
+      <w:r>
+        <w:t xml:space="preserve"> </w:t>
+      </w:r>
+      <w:r>
+        <w:rPr>
+          <w:rStyle w:val="VerbatimChar"/>
+        </w:rPr>
+        <w:t xml:space="preserve">ok</w:t>
+      </w:r>
+      <w:r>
+        <w:t xml:space="preserve"> </w:t>
+      </w:r>
+      <w:r>
+        <w:t xml:space="preserve">equal to</w:t>
+      </w:r>
+      <w:r>
+        <w:t xml:space="preserve"> </w:t>
+      </w:r>
+      <w:r>
+        <w:rPr>
+          <w:rStyle w:val="VerbatimChar"/>
+        </w:rPr>
+        <w:t xml:space="preserve">changesets</w:t>
+      </w:r>
+      <w:r>
+        <w:t xml:space="preserve"> </w:t>
+      </w:r>
+      <w:r>
+        <w:t xml:space="preserve">(2026-10-16: 143 of 143; 2026-10-19: 144 of 144, with 039); since 2026-10-22, 040 also appears in</w:t>
+      </w:r>
+      <w:r>
+        <w:t xml:space="preserve"> </w:t>
+      </w:r>
+      <w:r>
+        <w:rPr>
+          <w:rStyle w:val="VerbatimChar"/>
+        </w:rPr>
+        <w:t xml:space="preserve">DATABASECHANGELOG_OPERATIONS</w:t>
+      </w:r>
+      <w:r>
+        <w:t xml:space="preserve"> </w:t>
+      </w:r>
+      <w:r>
+        <w:t xml:space="preserve">and 041 in</w:t>
+      </w:r>
+      <w:r>
+        <w:t xml:space="preserve"> </w:t>
+      </w:r>
+      <w:r>
+        <w:rPr>
+          <w:rStyle w:val="VerbatimChar"/>
+        </w:rPr>
+        <w:t xml:space="preserve">DATABASECHANGELOG_NOTIFICATION</w:t>
+      </w:r>
+      <w:r>
+        <w:t xml:space="preserve">;</w:t>
+      </w:r>
+    </w:p>
+    <w:p>
+      <w:pPr>
+        <w:pStyle w:val="Compact"/>
+        <w:numPr>
+          <w:ilvl w:val="0"/>
+          <w:numId w:val="1029"/>
+        </w:numPr>
+      </w:pPr>
+      <w:r>
+        <w:t xml:space="preserve">the initial administrator created (security log:</w:t>
+      </w:r>
+      <w:r>
+        <w:t xml:space="preserve"> </w:t>
+      </w:r>
+      <w:r>
+        <w:rPr>
+          <w:rStyle w:val="VerbatimChar"/>
+        </w:rPr>
+        <w:t xml:space="preserve">First administrator created</w:t>
+      </w:r>
+      <w:r>
+        <w:t xml:space="preserve">).</w:t>
+      </w:r>
+    </w:p>
+    <w:bookmarkEnd w:id="60"/>
+    <w:bookmarkEnd w:id="61"/>
+    <w:bookmarkStart w:id="66" w:name="X7005f183192c0821308cfbcb7aaaff2714f1b27"/>
+    <w:p>
+      <w:pPr>
+        <w:pStyle w:val="Heading3"/>
+      </w:pPr>
+      <w:r>
+        <w:t xml:space="preserve">4.3 Application Stack Deployment and Orchestration</w:t>
+      </w:r>
+    </w:p>
+    <w:bookmarkStart w:id="62" w:name="X35bcd2e0f3203d2678b4d8bbc2703cb98290b05"/>
+    <w:p>
+      <w:pPr>
+        <w:pStyle w:val="Heading4"/>
+      </w:pPr>
+      <w:r>
+        <w:t xml:space="preserve">4.3.1 Loading the docker-compose.yml file in Portainer</w:t>
+      </w:r>
+    </w:p>
+    <w:p>
+      <w:pPr>
+        <w:pStyle w:val="FirstParagraph"/>
+      </w:pPr>
+      <w:r>
+        <w:t xml:space="preserve">The stack is defined with two files versioned in</w:t>
+      </w:r>
+      <w:r>
+        <w:t xml:space="preserve"> </w:t>
+      </w:r>
+      <w:r>
+        <w:rPr>
+          <w:rStyle w:val="VerbatimChar"/>
+        </w:rPr>
+        <w:t xml:space="preserve">lavarapido-infra</w:t>
+      </w:r>
+      <w:r>
         <w:t xml:space="preserve">:</w:t>
-      </w:r>
-      <w:r>
-        <w:t xml:space="preserve"> </w:t>
-      </w:r>
-      <w:r>
-        <w:t xml:space="preserve">overrides the production settings: no internal ports,</w:t>
-      </w:r>
-      <w:r>
-        <w:t xml:space="preserve"> </w:t>
-      </w:r>
-      <w:r>
-        <w:rPr>
-          <w:rStyle w:val="VerbatimChar"/>
-        </w:rPr>
-        <w:t xml:space="preserve">prod</w:t>
-      </w:r>
-      <w:r>
-        <w:t xml:space="preserve"> </w:t>
-      </w:r>
-      <w:r>
-        <w:t xml:space="preserve">profile, memory limits, Caddy, web and CORS.</w:t>
-      </w:r>
-    </w:p>
-    <w:p>
-      <w:pPr>
-        <w:pStyle w:val="FirstParagraph"/>
-      </w:pPr>
-      <w:r>
-        <w:rPr>
-          <w:b/>
-          <w:bCs/>
-        </w:rPr>
-        <w:t xml:space="preserve">Current deployment (CLI):</w:t>
-      </w:r>
-    </w:p>
-    <w:p>
-      <w:pPr>
-        <w:pStyle w:val="SourceCode"/>
-      </w:pPr>
-      <w:r>
-        <w:rPr>
-          <w:rStyle w:val="CommentTok"/>
-        </w:rPr>
-        <w:t xml:space="preserve"># 1. Download the 9 repositories (and prepare Docker and swap the first time)</w:t>
-      </w:r>
-      <w:r>
-        <w:br/>
-      </w:r>
-      <w:r>
-        <w:rPr>
-          <w:rStyle w:val="ExtensionTok"/>
-        </w:rPr>
-        <w:t xml:space="preserve">curl</w:t>
-      </w:r>
-      <w:r>
-        <w:rPr>
-          <w:rStyle w:val="NormalTok"/>
-        </w:rPr>
-        <w:t xml:space="preserve"> </w:t>
-      </w:r>
-      <w:r>
-        <w:rPr>
-          <w:rStyle w:val="AttributeTok"/>
-        </w:rPr>
-        <w:t xml:space="preserve">-fsSL</w:t>
-      </w:r>
-      <w:r>
-        <w:rPr>
-          <w:rStyle w:val="NormalTok"/>
-        </w:rPr>
-        <w:t xml:space="preserve"> https://raw.githubusercontent.com/BrayanCABRERA123/lavarapido-infra/main/deploy/setup-server.sh </w:t>
-      </w:r>
-      <w:r>
-        <w:rPr>
-          <w:rStyle w:val="AttributeTok"/>
-        </w:rPr>
-        <w:t xml:space="preserve">-o</w:t>
-      </w:r>
-      <w:r>
-        <w:rPr>
-          <w:rStyle w:val="NormalTok"/>
-        </w:rPr>
-        <w:t xml:space="preserve"> setup-server.sh</w:t>
-      </w:r>
-      <w:r>
-        <w:br/>
-      </w:r>
-      <w:r>
-        <w:rPr>
-          <w:rStyle w:val="FunctionTok"/>
-        </w:rPr>
-        <w:t xml:space="preserve">bash</w:t>
-      </w:r>
-      <w:r>
-        <w:rPr>
-          <w:rStyle w:val="NormalTok"/>
-        </w:rPr>
-        <w:t xml:space="preserve"> setup-server.sh</w:t>
-      </w:r>
-    </w:p>
-    <w:p>
-      <w:pPr>
-        <w:pStyle w:val="FirstParagraph"/>
-      </w:pPr>
-      <w:r>
-        <w:t xml:space="preserve">The script is downloaded from</w:t>
-      </w:r>
-      <w:r>
-        <w:t xml:space="preserve"> </w:t>
-      </w:r>
-      <w:r>
-        <w:rPr>
-          <w:rStyle w:val="VerbatimChar"/>
-        </w:rPr>
-        <w:t xml:space="preserve">main</w:t>
-      </w:r>
-      <w:r>
-        <w:t xml:space="preserve"> </w:t>
-      </w:r>
-      <w:r>
-        <w:t xml:space="preserve">(version</w:t>
-      </w:r>
-      <w:r>
-        <w:t xml:space="preserve"> </w:t>
-      </w:r>
-      <w:r>
-        <w:rPr>
-          <w:rStyle w:val="VerbatimChar"/>
-        </w:rPr>
-        <w:t xml:space="preserve">v1.0.0</w:t>
-      </w:r>
-      <w:r>
-        <w:t xml:space="preserve">). In that version it clones and updates the</w:t>
-      </w:r>
-      <w:r>
-        <w:t xml:space="preserve"> </w:t>
-      </w:r>
-      <w:r>
-        <w:rPr>
-          <w:rStyle w:val="VerbatimChar"/>
-        </w:rPr>
-        <w:t xml:space="preserve">develop</w:t>
-      </w:r>
-      <w:r>
-        <w:t xml:space="preserve"> </w:t>
-      </w:r>
-      <w:r>
-        <w:t xml:space="preserve">branch of each repository (variable</w:t>
-      </w:r>
-      <w:r>
-        <w:t xml:space="preserve"> </w:t>
-      </w:r>
-      <w:r>
-        <w:rPr>
-          <w:rStyle w:val="VerbatimChar"/>
-        </w:rPr>
-        <w:t xml:space="preserve">BRANCH</w:t>
-      </w:r>
-      <w:r>
-        <w:t xml:space="preserve">). The one in</w:t>
-      </w:r>
-      <w:r>
-        <w:t xml:space="preserve"> </w:t>
-      </w:r>
-      <w:r>
-        <w:rPr>
-          <w:rStyle w:val="VerbatimChar"/>
-        </w:rPr>
-        <w:t xml:space="preserve">develop</w:t>
-      </w:r>
-      <w:r>
-        <w:t xml:space="preserve"> </w:t>
-      </w:r>
-      <w:r>
-        <w:t xml:space="preserve">(running on the server since 2026-10-24) clones</w:t>
-      </w:r>
-      <w:r>
-        <w:t xml:space="preserve"> </w:t>
-      </w:r>
-      <w:r>
-        <w:rPr>
-          <w:rStyle w:val="VerbatimChar"/>
-        </w:rPr>
-        <w:t xml:space="preserve">main</w:t>
-      </w:r>
-      <w:r>
-        <w:t xml:space="preserve"> </w:t>
-      </w:r>
-      <w:r>
-        <w:t xml:space="preserve">by default, except the repositories in</w:t>
-      </w:r>
-      <w:r>
-        <w:t xml:space="preserve"> </w:t>
-      </w:r>
-      <w:r>
-        <w:rPr>
-          <w:rStyle w:val="VerbatimChar"/>
-        </w:rPr>
-        <w:t xml:space="preserve">DEVELOP_ONLY</w:t>
-      </w:r>
-      <w:r>
-        <w:t xml:space="preserve"> </w:t>
-      </w:r>
-      <w:r>
-        <w:t xml:space="preserve">(today payment-service; since 2026-10-24 its</w:t>
-      </w:r>
-      <w:r>
-        <w:t xml:space="preserve"> </w:t>
-      </w:r>
-      <w:r>
-        <w:rPr>
-          <w:rStyle w:val="VerbatimChar"/>
-        </w:rPr>
-        <w:t xml:space="preserve">main</w:t>
-      </w:r>
-      <w:r>
-        <w:t xml:space="preserve"> </w:t>
-      </w:r>
-      <w:r>
-        <w:t xml:space="preserve">already has</w:t>
-      </w:r>
-      <w:r>
-        <w:t xml:space="preserve"> </w:t>
-      </w:r>
-      <w:r>
-        <w:rPr>
-          <w:rStyle w:val="VerbatimChar"/>
-        </w:rPr>
-        <w:t xml:space="preserve">v1.0.0</w:t>
-      </w:r>
-      <w:r>
-        <w:t xml:space="preserve"> </w:t>
-      </w:r>
-      <w:r>
-        <w:t xml:space="preserve">with its whole</w:t>
-      </w:r>
-      <w:r>
-        <w:t xml:space="preserve"> </w:t>
-      </w:r>
-      <w:r>
-        <w:rPr>
-          <w:rStyle w:val="VerbatimChar"/>
-        </w:rPr>
-        <w:t xml:space="preserve">develop</w:t>
-      </w:r>
-      <w:r>
-        <w:t xml:space="preserve">, so it can be removed from the list), and never downgrades: if a repository already pulled has something the requested branch does not contain, it stops without touching it. Until</w:t>
-      </w:r>
-      <w:r>
-        <w:t xml:space="preserve"> </w:t>
-      </w:r>
-      <w:r>
-        <w:rPr>
-          <w:rStyle w:val="VerbatimChar"/>
-        </w:rPr>
-        <w:t xml:space="preserve">v1.1.0</w:t>
-      </w:r>
-      <w:r>
-        <w:t xml:space="preserve"> </w:t>
-      </w:r>
-      <w:r>
-        <w:t xml:space="preserve">is released, use</w:t>
-      </w:r>
-      <w:r>
-        <w:t xml:space="preserve"> </w:t>
-      </w:r>
-      <w:r>
-        <w:rPr>
-          <w:rStyle w:val="VerbatimChar"/>
-        </w:rPr>
-        <w:t xml:space="preserve">BRANCH=develop bash setup-server.sh</w:t>
-      </w:r>
-      <w:r>
-        <w:t xml:space="preserve">.</w:t>
-      </w:r>
-    </w:p>
-    <w:p>
-      <w:pPr>
-        <w:pStyle w:val="BodyText"/>
-      </w:pPr>
-      <w:r>
-        <w:rPr>
-          <w:b/>
-          <w:bCs/>
-        </w:rPr>
-        <w:t xml:space="preserve">With Portainer:</w:t>
-      </w:r>
-      <w:r>
-        <w:t xml:space="preserve"> </w:t>
-      </w:r>
-      <w:r>
-        <w:t xml:space="preserve">Stacks → Add stack →</w:t>
-      </w:r>
-      <w:r>
-        <w:t xml:space="preserve"> </w:t>
-      </w:r>
-      <w:r>
-        <w:rPr>
-          <w:i/>
-          <w:iCs/>
-        </w:rPr>
-        <w:t xml:space="preserve">Repository</w:t>
-      </w:r>
-      <w:r>
-        <w:t xml:space="preserve">. The images are built from 9 sibling repositories, so the recommended flow is:</w:t>
       </w:r>
     </w:p>
     <w:p>
@@ -18070,7 +18128,25 @@
         </w:numPr>
       </w:pPr>
       <w:r>
-        <w:t xml:space="preserve">build the images with the CLI (step 4.3.3);</w:t>
+        <w:rPr>
+          <w:rStyle w:val="VerbatimChar"/>
+          <w:b/>
+          <w:bCs/>
+        </w:rPr>
+        <w:t xml:space="preserve">docker-compose.yml</w:t>
+      </w:r>
+      <w:r>
+        <w:rPr>
+          <w:b/>
+          <w:bCs/>
+        </w:rPr>
+        <w:t xml:space="preserve">:</w:t>
+      </w:r>
+      <w:r>
+        <w:t xml:space="preserve"> </w:t>
+      </w:r>
+      <w:r>
+        <w:t xml:space="preserve">the base, the same as in development.</w:t>
       </w:r>
     </w:p>
     <w:p>
@@ -18082,48 +18158,52 @@
         </w:numPr>
       </w:pPr>
       <w:r>
-        <w:t xml:space="preserve">use Portainer to</w:t>
-      </w:r>
-      <w:r>
-        <w:t xml:space="preserve"> </w:t>
-      </w:r>
-      <w:r>
-        <w:rPr>
+        <w:rPr>
+          <w:rStyle w:val="VerbatimChar"/>
           <w:b/>
           <w:bCs/>
         </w:rPr>
-        <w:t xml:space="preserve">view, restart, check logs and resource usage</w:t>
-      </w:r>
-      <w:r>
-        <w:t xml:space="preserve"> </w:t>
-      </w:r>
-      <w:r>
-        <w:t xml:space="preserve">of the containers of the</w:t>
-      </w:r>
-      <w:r>
-        <w:t xml:space="preserve"> </w:t>
-      </w:r>
-      <w:r>
-        <w:rPr>
-          <w:rStyle w:val="VerbatimChar"/>
-        </w:rPr>
-        <w:t xml:space="preserve">lavarapido</w:t>
-      </w:r>
-      <w:r>
-        <w:t xml:space="preserve"> </w:t>
-      </w:r>
-      <w:r>
-        <w:t xml:space="preserve">stack, which appears as a "limited" stack because it was created outside Portainer.</w:t>
-      </w:r>
-    </w:p>
-    <w:bookmarkEnd w:id="61"/>
-    <w:bookmarkStart w:id="62" w:name="X2baf1b918c9ecc4573515860d0963fd4c399865"/>
-    <w:p>
-      <w:pPr>
-        <w:pStyle w:val="Heading4"/>
-      </w:pPr>
-      <w:r>
-        <w:t xml:space="preserve">4.3.2 Injecting the Stack's environment variables</w:t>
+        <w:t xml:space="preserve">docker-compose.prod.yml</w:t>
+      </w:r>
+      <w:r>
+        <w:rPr>
+          <w:b/>
+          <w:bCs/>
+        </w:rPr>
+        <w:t xml:space="preserve">:</w:t>
+      </w:r>
+      <w:r>
+        <w:t xml:space="preserve"> </w:t>
+      </w:r>
+      <w:r>
+        <w:t xml:space="preserve">overrides the production settings: no internal ports,</w:t>
+      </w:r>
+      <w:r>
+        <w:t xml:space="preserve"> </w:t>
+      </w:r>
+      <w:r>
+        <w:rPr>
+          <w:rStyle w:val="VerbatimChar"/>
+        </w:rPr>
+        <w:t xml:space="preserve">prod</w:t>
+      </w:r>
+      <w:r>
+        <w:t xml:space="preserve"> </w:t>
+      </w:r>
+      <w:r>
+        <w:t xml:space="preserve">profile, memory limits, Caddy, web and CORS.</w:t>
+      </w:r>
+    </w:p>
+    <w:p>
+      <w:pPr>
+        <w:pStyle w:val="FirstParagraph"/>
+      </w:pPr>
+      <w:r>
+        <w:rPr>
+          <w:b/>
+          <w:bCs/>
+        </w:rPr>
+        <w:t xml:space="preserve">Current deployment (CLI):</w:t>
       </w:r>
     </w:p>
     <w:p>
@@ -18132,15 +18212,48 @@
       </w:pPr>
       <w:r>
         <w:rPr>
-          <w:rStyle w:val="BuiltInTok"/>
-        </w:rPr>
-        <w:t xml:space="preserve">cd</w:t>
+          <w:rStyle w:val="CommentTok"/>
+        </w:rPr>
+        <w:t xml:space="preserve"># 1. Download the 9 repositories (and prepare Docker and swap the first time)</w:t>
+      </w:r>
+      <w:r>
+        <w:br/>
+      </w:r>
+      <w:r>
+        <w:rPr>
+          <w:rStyle w:val="ExtensionTok"/>
+        </w:rPr>
+        <w:t xml:space="preserve">curl</w:t>
       </w:r>
       <w:r>
         <w:rPr>
           <w:rStyle w:val="NormalTok"/>
         </w:rPr>
-        <w:t xml:space="preserve"> ~/lavarapido/lavarapido-infra</w:t>
+        <w:t xml:space="preserve"> </w:t>
+      </w:r>
+      <w:r>
+        <w:rPr>
+          <w:rStyle w:val="AttributeTok"/>
+        </w:rPr>
+        <w:t xml:space="preserve">-fsSL</w:t>
+      </w:r>
+      <w:r>
+        <w:rPr>
+          <w:rStyle w:val="NormalTok"/>
+        </w:rPr>
+        <w:t xml:space="preserve"> https://raw.githubusercontent.com/BrayanCABRERA123/lavarapido-infra/main/deploy/setup-server.sh </w:t>
+      </w:r>
+      <w:r>
+        <w:rPr>
+          <w:rStyle w:val="AttributeTok"/>
+        </w:rPr>
+        <w:t xml:space="preserve">-o</w:t>
+      </w:r>
+      <w:r>
+        <w:rPr>
+          <w:rStyle w:val="NormalTok"/>
+        </w:rPr>
+        <w:t xml:space="preserve"> setup-server.sh</w:t>
       </w:r>
       <w:r>
         <w:br/>
@@ -18149,49 +18262,13 @@
         <w:rPr>
           <w:rStyle w:val="FunctionTok"/>
         </w:rPr>
-        <w:t xml:space="preserve">cp</w:t>
+        <w:t xml:space="preserve">bash</w:t>
       </w:r>
       <w:r>
         <w:rPr>
           <w:rStyle w:val="NormalTok"/>
         </w:rPr>
-        <w:t xml:space="preserve"> .env.production.example .env.production</w:t>
-      </w:r>
-      <w:r>
-        <w:br/>
-      </w:r>
-      <w:r>
-        <w:rPr>
-          <w:rStyle w:val="FunctionTok"/>
-        </w:rPr>
-        <w:t xml:space="preserve">chmod</w:t>
-      </w:r>
-      <w:r>
-        <w:rPr>
-          <w:rStyle w:val="NormalTok"/>
-        </w:rPr>
-        <w:t xml:space="preserve"> 600 .env.production</w:t>
-      </w:r>
-      <w:r>
-        <w:br/>
-      </w:r>
-      <w:r>
-        <w:rPr>
-          <w:rStyle w:val="FunctionTok"/>
-        </w:rPr>
-        <w:t xml:space="preserve">nano</w:t>
-      </w:r>
-      <w:r>
-        <w:rPr>
-          <w:rStyle w:val="NormalTok"/>
-        </w:rPr>
-        <w:t xml:space="preserve"> .env.production        </w:t>
-      </w:r>
-      <w:r>
-        <w:rPr>
-          <w:rStyle w:val="CommentTok"/>
-        </w:rPr>
-        <w:t xml:space="preserve"># fill in the values from section 3.3 (keys generated with openssl)</w:t>
+        <w:t xml:space="preserve"> setup-server.sh</w:t>
       </w:r>
     </w:p>
     <w:p>
@@ -18199,7 +18276,193 @@
         <w:pStyle w:val="FirstParagraph"/>
       </w:pPr>
       <w:r>
-        <w:t xml:space="preserve">In Portainer, the same variables are loaded in</w:t>
+        <w:t xml:space="preserve">The script is downloaded from</w:t>
+      </w:r>
+      <w:r>
+        <w:t xml:space="preserve"> </w:t>
+      </w:r>
+      <w:r>
+        <w:rPr>
+          <w:rStyle w:val="VerbatimChar"/>
+        </w:rPr>
+        <w:t xml:space="preserve">main</w:t>
+      </w:r>
+      <w:r>
+        <w:t xml:space="preserve"> </w:t>
+      </w:r>
+      <w:r>
+        <w:t xml:space="preserve">(version</w:t>
+      </w:r>
+      <w:r>
+        <w:t xml:space="preserve"> </w:t>
+      </w:r>
+      <w:r>
+        <w:rPr>
+          <w:rStyle w:val="VerbatimChar"/>
+        </w:rPr>
+        <w:t xml:space="preserve">v1.0.0</w:t>
+      </w:r>
+      <w:r>
+        <w:t xml:space="preserve">). In that version it clones and updates the</w:t>
+      </w:r>
+      <w:r>
+        <w:t xml:space="preserve"> </w:t>
+      </w:r>
+      <w:r>
+        <w:rPr>
+          <w:rStyle w:val="VerbatimChar"/>
+        </w:rPr>
+        <w:t xml:space="preserve">develop</w:t>
+      </w:r>
+      <w:r>
+        <w:t xml:space="preserve"> </w:t>
+      </w:r>
+      <w:r>
+        <w:t xml:space="preserve">branch of each repository (variable</w:t>
+      </w:r>
+      <w:r>
+        <w:t xml:space="preserve"> </w:t>
+      </w:r>
+      <w:r>
+        <w:rPr>
+          <w:rStyle w:val="VerbatimChar"/>
+        </w:rPr>
+        <w:t xml:space="preserve">BRANCH</w:t>
+      </w:r>
+      <w:r>
+        <w:t xml:space="preserve">). The one in</w:t>
+      </w:r>
+      <w:r>
+        <w:t xml:space="preserve"> </w:t>
+      </w:r>
+      <w:r>
+        <w:rPr>
+          <w:rStyle w:val="VerbatimChar"/>
+        </w:rPr>
+        <w:t xml:space="preserve">develop</w:t>
+      </w:r>
+      <w:r>
+        <w:t xml:space="preserve"> </w:t>
+      </w:r>
+      <w:r>
+        <w:t xml:space="preserve">(running on the server since 2026-10-24) clones</w:t>
+      </w:r>
+      <w:r>
+        <w:t xml:space="preserve"> </w:t>
+      </w:r>
+      <w:r>
+        <w:rPr>
+          <w:rStyle w:val="VerbatimChar"/>
+        </w:rPr>
+        <w:t xml:space="preserve">main</w:t>
+      </w:r>
+      <w:r>
+        <w:t xml:space="preserve"> </w:t>
+      </w:r>
+      <w:r>
+        <w:t xml:space="preserve">by default, except the repositories in</w:t>
+      </w:r>
+      <w:r>
+        <w:t xml:space="preserve"> </w:t>
+      </w:r>
+      <w:r>
+        <w:rPr>
+          <w:rStyle w:val="VerbatimChar"/>
+        </w:rPr>
+        <w:t xml:space="preserve">DEVELOP_ONLY</w:t>
+      </w:r>
+      <w:r>
+        <w:t xml:space="preserve"> </w:t>
+      </w:r>
+      <w:r>
+        <w:t xml:space="preserve">(today payment-service; since 2026-10-24 its</w:t>
+      </w:r>
+      <w:r>
+        <w:t xml:space="preserve"> </w:t>
+      </w:r>
+      <w:r>
+        <w:rPr>
+          <w:rStyle w:val="VerbatimChar"/>
+        </w:rPr>
+        <w:t xml:space="preserve">main</w:t>
+      </w:r>
+      <w:r>
+        <w:t xml:space="preserve"> </w:t>
+      </w:r>
+      <w:r>
+        <w:t xml:space="preserve">already has</w:t>
+      </w:r>
+      <w:r>
+        <w:t xml:space="preserve"> </w:t>
+      </w:r>
+      <w:r>
+        <w:rPr>
+          <w:rStyle w:val="VerbatimChar"/>
+        </w:rPr>
+        <w:t xml:space="preserve">v1.0.0</w:t>
+      </w:r>
+      <w:r>
+        <w:t xml:space="preserve"> </w:t>
+      </w:r>
+      <w:r>
+        <w:t xml:space="preserve">with its whole</w:t>
+      </w:r>
+      <w:r>
+        <w:t xml:space="preserve"> </w:t>
+      </w:r>
+      <w:r>
+        <w:rPr>
+          <w:rStyle w:val="VerbatimChar"/>
+        </w:rPr>
+        <w:t xml:space="preserve">develop</w:t>
+      </w:r>
+      <w:r>
+        <w:t xml:space="preserve">, so it can be removed from the list), and never downgrades: if a repository already pulled has something the requested branch does not contain, it stops without touching it. Until</w:t>
+      </w:r>
+      <w:r>
+        <w:t xml:space="preserve"> </w:t>
+      </w:r>
+      <w:r>
+        <w:rPr>
+          <w:rStyle w:val="VerbatimChar"/>
+        </w:rPr>
+        <w:t xml:space="preserve">v1.1.0</w:t>
+      </w:r>
+      <w:r>
+        <w:t xml:space="preserve"> </w:t>
+      </w:r>
+      <w:r>
+        <w:t xml:space="preserve">is released, use</w:t>
+      </w:r>
+      <w:r>
+        <w:t xml:space="preserve"> </w:t>
+      </w:r>
+      <w:r>
+        <w:rPr>
+          <w:rStyle w:val="VerbatimChar"/>
+        </w:rPr>
+        <w:t xml:space="preserve">BRANCH=develop bash setup-server.sh</w:t>
+      </w:r>
+      <w:r>
+        <w:t xml:space="preserve">.</w:t>
+      </w:r>
+    </w:p>
+    <w:p>
+      <w:pPr>
+        <w:pStyle w:val="BodyText"/>
+      </w:pPr>
+      <w:r>
+        <w:rPr>
+          <w:b/>
+          <w:bCs/>
+        </w:rPr>
+        <w:t xml:space="preserve">With Portainer:</w:t>
+      </w:r>
+      <w:r>
+        <w:t xml:space="preserve"> </w:t>
+      </w:r>
+      <w:r>
+        <w:t xml:space="preserve">Stacks → Add stack →</w:t>
       </w:r>
       <w:r>
         <w:t xml:space="preserve"> </w:t>
@@ -18209,14 +18472,168 @@
           <w:i/>
           <w:iCs/>
         </w:rPr>
+        <w:t xml:space="preserve">Repository</w:t>
+      </w:r>
+      <w:r>
+        <w:t xml:space="preserve">. The images are built from 9 sibling repositories, so the recommended flow is:</w:t>
+      </w:r>
+    </w:p>
+    <w:p>
+      <w:pPr>
+        <w:pStyle w:val="Compact"/>
+        <w:numPr>
+          <w:ilvl w:val="0"/>
+          <w:numId w:val="1031"/>
+        </w:numPr>
+      </w:pPr>
+      <w:r>
+        <w:t xml:space="preserve">build the images with the CLI (step 4.3.3);</w:t>
+      </w:r>
+    </w:p>
+    <w:p>
+      <w:pPr>
+        <w:pStyle w:val="Compact"/>
+        <w:numPr>
+          <w:ilvl w:val="0"/>
+          <w:numId w:val="1031"/>
+        </w:numPr>
+      </w:pPr>
+      <w:r>
+        <w:t xml:space="preserve">use Portainer to</w:t>
+      </w:r>
+      <w:r>
+        <w:t xml:space="preserve"> </w:t>
+      </w:r>
+      <w:r>
+        <w:rPr>
+          <w:b/>
+          <w:bCs/>
+        </w:rPr>
+        <w:t xml:space="preserve">view, restart, check logs and resource usage</w:t>
+      </w:r>
+      <w:r>
+        <w:t xml:space="preserve"> </w:t>
+      </w:r>
+      <w:r>
+        <w:t xml:space="preserve">of the containers of the</w:t>
+      </w:r>
+      <w:r>
+        <w:t xml:space="preserve"> </w:t>
+      </w:r>
+      <w:r>
+        <w:rPr>
+          <w:rStyle w:val="VerbatimChar"/>
+        </w:rPr>
+        <w:t xml:space="preserve">lavarapido</w:t>
+      </w:r>
+      <w:r>
+        <w:t xml:space="preserve"> </w:t>
+      </w:r>
+      <w:r>
+        <w:t xml:space="preserve">stack, which appears as a "limited" stack because it was created outside Portainer.</w:t>
+      </w:r>
+    </w:p>
+    <w:bookmarkEnd w:id="62"/>
+    <w:bookmarkStart w:id="63" w:name="X2baf1b918c9ecc4573515860d0963fd4c399865"/>
+    <w:p>
+      <w:pPr>
+        <w:pStyle w:val="Heading4"/>
+      </w:pPr>
+      <w:r>
+        <w:t xml:space="preserve">4.3.2 Injecting the Stack's environment variables</w:t>
+      </w:r>
+    </w:p>
+    <w:p>
+      <w:pPr>
+        <w:pStyle w:val="SourceCode"/>
+      </w:pPr>
+      <w:r>
+        <w:rPr>
+          <w:rStyle w:val="BuiltInTok"/>
+        </w:rPr>
+        <w:t xml:space="preserve">cd</w:t>
+      </w:r>
+      <w:r>
+        <w:rPr>
+          <w:rStyle w:val="NormalTok"/>
+        </w:rPr>
+        <w:t xml:space="preserve"> ~/lavarapido/lavarapido-infra</w:t>
+      </w:r>
+      <w:r>
+        <w:br/>
+      </w:r>
+      <w:r>
+        <w:rPr>
+          <w:rStyle w:val="FunctionTok"/>
+        </w:rPr>
+        <w:t xml:space="preserve">cp</w:t>
+      </w:r>
+      <w:r>
+        <w:rPr>
+          <w:rStyle w:val="NormalTok"/>
+        </w:rPr>
+        <w:t xml:space="preserve"> .env.production.example .env.production</w:t>
+      </w:r>
+      <w:r>
+        <w:br/>
+      </w:r>
+      <w:r>
+        <w:rPr>
+          <w:rStyle w:val="FunctionTok"/>
+        </w:rPr>
+        <w:t xml:space="preserve">chmod</w:t>
+      </w:r>
+      <w:r>
+        <w:rPr>
+          <w:rStyle w:val="NormalTok"/>
+        </w:rPr>
+        <w:t xml:space="preserve"> 600 .env.production</w:t>
+      </w:r>
+      <w:r>
+        <w:br/>
+      </w:r>
+      <w:r>
+        <w:rPr>
+          <w:rStyle w:val="FunctionTok"/>
+        </w:rPr>
+        <w:t xml:space="preserve">nano</w:t>
+      </w:r>
+      <w:r>
+        <w:rPr>
+          <w:rStyle w:val="NormalTok"/>
+        </w:rPr>
+        <w:t xml:space="preserve"> .env.production        </w:t>
+      </w:r>
+      <w:r>
+        <w:rPr>
+          <w:rStyle w:val="CommentTok"/>
+        </w:rPr>
+        <w:t xml:space="preserve"># fill in the values from section 3.3 (keys generated with openssl)</w:t>
+      </w:r>
+    </w:p>
+    <w:p>
+      <w:pPr>
+        <w:pStyle w:val="FirstParagraph"/>
+      </w:pPr>
+      <w:r>
+        <w:t xml:space="preserve">In Portainer, the same variables are loaded in</w:t>
+      </w:r>
+      <w:r>
+        <w:t xml:space="preserve"> </w:t>
+      </w:r>
+      <w:r>
+        <w:rPr>
+          <w:i/>
+          <w:iCs/>
+        </w:rPr>
         <w:t xml:space="preserve">Environment variables → Load variables from .env file</w:t>
       </w:r>
       <w:r>
         <w:t xml:space="preserve">.</w:t>
       </w:r>
     </w:p>
-    <w:bookmarkEnd w:id="62"/>
-    <w:bookmarkStart w:id="63" w:name="X87c66d6d168cbcfcae841acb93f3a5272dd2e2a"/>
+    <w:bookmarkEnd w:id="63"/>
+    <w:bookmarkStart w:id="64" w:name="X87c66d6d168cbcfcae841acb93f3a5272dd2e2a"/>
     <w:p>
       <w:pPr>
         <w:pStyle w:val="Heading4"/>
@@ -19151,8 +19568,8 @@
         </w:tc>
       </w:tr>
     </w:tbl>
-    <w:bookmarkEnd w:id="63"/>
-    <w:bookmarkStart w:id="64" w:name="X5b6936c1a6c010a1688d11a143bb9a47c11a6c0"/>
+    <w:bookmarkEnd w:id="64"/>
+    <w:bookmarkStart w:id="65" w:name="X5b6936c1a6c010a1688d11a143bb9a47c11a6c0"/>
     <w:p>
       <w:pPr>
         <w:pStyle w:val="Heading4"/>
@@ -19290,7 +19707,7 @@
         <w:pStyle w:val="Compact"/>
         <w:numPr>
           <w:ilvl w:val="0"/>
-          <w:numId w:val="1031"/>
+          <w:numId w:val="1032"/>
         </w:numPr>
       </w:pPr>
       <w:r>
@@ -19524,7 +19941,7 @@
         <w:pStyle w:val="Compact"/>
         <w:numPr>
           <w:ilvl w:val="0"/>
-          <w:numId w:val="1031"/>
+          <w:numId w:val="1032"/>
         </w:numPr>
       </w:pPr>
       <w:r>
@@ -19646,7 +20063,7 @@
         <w:pStyle w:val="Compact"/>
         <w:numPr>
           <w:ilvl w:val="0"/>
-          <w:numId w:val="1031"/>
+          <w:numId w:val="1032"/>
         </w:numPr>
       </w:pPr>
       <w:r>
@@ -19743,7 +20160,7 @@
         <w:pStyle w:val="Compact"/>
         <w:numPr>
           <w:ilvl w:val="0"/>
-          <w:numId w:val="1031"/>
+          <w:numId w:val="1032"/>
         </w:numPr>
       </w:pPr>
       <w:r>
@@ -20570,9 +20987,9 @@
         <w:t xml:space="preserve"># screen-only changes: over-the-internet update</w:t>
       </w:r>
     </w:p>
-    <w:bookmarkEnd w:id="64"/>
     <w:bookmarkEnd w:id="65"/>
-    <w:bookmarkStart w:id="66" w:name="X8afac7ca51d6aadb1fa4d0d4fc86ed16dc1d7e8"/>
+    <w:bookmarkEnd w:id="66"/>
+    <w:bookmarkStart w:id="67" w:name="X8afac7ca51d6aadb1fa4d0d4fc86ed16dc1d7e8"/>
     <w:p>
       <w:pPr>
         <w:pStyle w:val="Heading3"/>
@@ -20586,7 +21003,7 @@
         <w:pStyle w:val="Compact"/>
         <w:numPr>
           <w:ilvl w:val="0"/>
-          <w:numId w:val="1032"/>
+          <w:numId w:val="1033"/>
         </w:numPr>
       </w:pPr>
       <w:r>
@@ -20663,7 +21080,7 @@
         <w:pStyle w:val="Compact"/>
         <w:numPr>
           <w:ilvl w:val="0"/>
-          <w:numId w:val="1032"/>
+          <w:numId w:val="1033"/>
         </w:numPr>
       </w:pPr>
       <w:r>
@@ -20715,7 +21132,7 @@
         <w:pStyle w:val="Compact"/>
         <w:numPr>
           <w:ilvl w:val="0"/>
-          <w:numId w:val="1032"/>
+          <w:numId w:val="1033"/>
         </w:numPr>
       </w:pPr>
       <w:r>
@@ -20743,7 +21160,7 @@
         <w:pStyle w:val="Compact"/>
         <w:numPr>
           <w:ilvl w:val="0"/>
-          <w:numId w:val="1032"/>
+          <w:numId w:val="1033"/>
         </w:numPr>
       </w:pPr>
       <w:r>
@@ -20924,7 +21341,7 @@
         <w:pStyle w:val="Compact"/>
         <w:numPr>
           <w:ilvl w:val="0"/>
-          <w:numId w:val="1032"/>
+          <w:numId w:val="1033"/>
         </w:numPr>
       </w:pPr>
       <w:r>
@@ -20984,9 +21401,9 @@
         </w:pict>
       </w:r>
     </w:p>
-    <w:bookmarkEnd w:id="66"/>
     <w:bookmarkEnd w:id="67"/>
-    <w:bookmarkStart w:id="109" w:name="X11ebf88a84ad7ca4e0958c6957089702f0563b4"/>
+    <w:bookmarkEnd w:id="68"/>
+    <w:bookmarkStart w:id="110" w:name="X11ebf88a84ad7ca4e0958c6957089702f0563b4"/>
     <w:p>
       <w:pPr>
         <w:pStyle w:val="Heading2"/>
@@ -20995,7 +21412,7 @@
         <w:t xml:space="preserve">5. Verification, Testing and Evidence Plan (Smoke Tests)</w:t>
       </w:r>
     </w:p>
-    <w:bookmarkStart w:id="73" w:name="Xb1326ffc63c2881020b67e4410c42b571ce6920"/>
+    <w:bookmarkStart w:id="74" w:name="Xb1326ffc63c2881020b67e4410c42b571ce6920"/>
     <w:p>
       <w:pPr>
         <w:pStyle w:val="Heading3"/>
@@ -21004,7 +21421,7 @@
         <w:t xml:space="preserve">5.1 Service Verification Links and Endpoints Matrix</w:t>
       </w:r>
     </w:p>
-    <w:bookmarkStart w:id="68" w:name="Xd66384c6f6ef1e3a5af25748faf6d620e166a1e"/>
+    <w:bookmarkStart w:id="69" w:name="Xd66384c6f6ef1e3a5af25748faf6d620e166a1e"/>
     <w:p>
       <w:pPr>
         <w:pStyle w:val="Heading4"/>
@@ -21199,8 +21616,8 @@
         </w:tc>
       </w:tr>
     </w:tbl>
-    <w:bookmarkEnd w:id="68"/>
-    <w:bookmarkStart w:id="69" w:name="X7079f699258d6b2a97ec443982a6f7d672d90ff"/>
+    <w:bookmarkEnd w:id="69"/>
+    <w:bookmarkStart w:id="70" w:name="X7079f699258d6b2a97ec443982a6f7d672d90ff"/>
     <w:p>
       <w:pPr>
         <w:pStyle w:val="Heading4"/>
@@ -21491,8 +21908,8 @@
         </w:tc>
       </w:tr>
     </w:tbl>
-    <w:bookmarkEnd w:id="69"/>
-    <w:bookmarkStart w:id="70" w:name="X5f52dd7ec75fa1f56efd98ae99d21b926d27f84"/>
+    <w:bookmarkEnd w:id="70"/>
+    <w:bookmarkStart w:id="71" w:name="X5f52dd7ec75fa1f56efd98ae99d21b926d27f84"/>
     <w:p>
       <w:pPr>
         <w:pStyle w:val="Heading4"/>
@@ -21862,8 +22279,8 @@
         <w:t xml:space="preserve">.</w:t>
       </w:r>
     </w:p>
-    <w:bookmarkEnd w:id="70"/>
-    <w:bookmarkStart w:id="71" w:name="Xf1b18a6250d98df5d88ae02196a22090678ec45"/>
+    <w:bookmarkEnd w:id="71"/>
+    <w:bookmarkStart w:id="72" w:name="Xf1b18a6250d98df5d88ae02196a22090678ec45"/>
     <w:p>
       <w:pPr>
         <w:pStyle w:val="Heading4"/>
@@ -21877,7 +22294,7 @@
         <w:pStyle w:val="Compact"/>
         <w:numPr>
           <w:ilvl w:val="0"/>
-          <w:numId w:val="1033"/>
+          <w:numId w:val="1034"/>
         </w:numPr>
       </w:pPr>
       <w:r>
@@ -21911,7 +22328,7 @@
         <w:pStyle w:val="Compact"/>
         <w:numPr>
           <w:ilvl w:val="0"/>
-          <w:numId w:val="1033"/>
+          <w:numId w:val="1034"/>
         </w:numPr>
       </w:pPr>
       <w:r>
@@ -21963,7 +22380,7 @@
         <w:pStyle w:val="Compact"/>
         <w:numPr>
           <w:ilvl w:val="0"/>
-          <w:numId w:val="1033"/>
+          <w:numId w:val="1034"/>
         </w:numPr>
       </w:pPr>
       <w:r>
@@ -21982,8 +22399,8 @@
         <w:t xml:space="preserve">.</w:t>
       </w:r>
     </w:p>
-    <w:bookmarkEnd w:id="71"/>
-    <w:bookmarkStart w:id="72" w:name="X948661daf4ca406e73437792b0c335111afa9d6"/>
+    <w:bookmarkEnd w:id="72"/>
+    <w:bookmarkStart w:id="73" w:name="X948661daf4ca406e73437792b0c335111afa9d6"/>
     <w:p>
       <w:pPr>
         <w:pStyle w:val="Heading4"/>
@@ -22267,9 +22684,9 @@
         <w:t xml:space="preserve"># from outside: must FAIL (port closed)</w:t>
       </w:r>
     </w:p>
-    <w:bookmarkEnd w:id="72"/>
     <w:bookmarkEnd w:id="73"/>
-    <w:bookmarkStart w:id="78" w:name="Xfbe34d1e8320aab157e9f7bef1ee88119cf48a4"/>
+    <w:bookmarkEnd w:id="74"/>
+    <w:bookmarkStart w:id="79" w:name="Xfbe34d1e8320aab157e9f7bef1ee88119cf48a4"/>
     <w:p>
       <w:pPr>
         <w:pStyle w:val="Heading3"/>
@@ -22278,7 +22695,7 @@
         <w:t xml:space="preserve">5.2 Functional Smoke Tests</w:t>
       </w:r>
     </w:p>
-    <w:bookmarkStart w:id="74" w:name="Xe8ecf0299452044cdf1f1fb493b422bfe01f212"/>
+    <w:bookmarkStart w:id="75" w:name="Xe8ecf0299452044cdf1f1fb493b422bfe01f212"/>
     <w:p>
       <w:pPr>
         <w:pStyle w:val="Heading4"/>
@@ -22563,8 +22980,8 @@
         </w:tc>
       </w:tr>
     </w:tbl>
-    <w:bookmarkEnd w:id="74"/>
-    <w:bookmarkStart w:id="75" w:name="X257c1a1c550b277bdcdd6d74c8567c324139a69"/>
+    <w:bookmarkEnd w:id="75"/>
+    <w:bookmarkStart w:id="76" w:name="X257c1a1c550b277bdcdd6d74c8567c324139a69"/>
     <w:p>
       <w:pPr>
         <w:pStyle w:val="Heading4"/>
@@ -22698,8 +23115,8 @@
         </w:tc>
       </w:tr>
     </w:tbl>
-    <w:bookmarkEnd w:id="75"/>
-    <w:bookmarkStart w:id="76" w:name="X5230af546335995fe5a9efa1740a60b21c8b533"/>
+    <w:bookmarkEnd w:id="76"/>
+    <w:bookmarkStart w:id="77" w:name="X5230af546335995fe5a9efa1740a60b21c8b533"/>
     <w:p>
       <w:pPr>
         <w:pStyle w:val="Heading4"/>
@@ -23025,7 +23442,7 @@
         <w:pStyle w:val="Compact"/>
         <w:numPr>
           <w:ilvl w:val="0"/>
-          <w:numId w:val="1034"/>
+          <w:numId w:val="1035"/>
         </w:numPr>
       </w:pPr>
       <w:r>
@@ -23047,7 +23464,7 @@
         <w:pStyle w:val="Compact"/>
         <w:numPr>
           <w:ilvl w:val="0"/>
-          <w:numId w:val="1034"/>
+          <w:numId w:val="1035"/>
         </w:numPr>
       </w:pPr>
       <w:r>
@@ -23063,7 +23480,7 @@
         <w:pStyle w:val="Compact"/>
         <w:numPr>
           <w:ilvl w:val="1"/>
-          <w:numId w:val="1035"/>
+          <w:numId w:val="1036"/>
         </w:numPr>
       </w:pPr>
       <w:r>
@@ -23075,7 +23492,7 @@
         <w:pStyle w:val="Compact"/>
         <w:numPr>
           <w:ilvl w:val="1"/>
-          <w:numId w:val="1035"/>
+          <w:numId w:val="1036"/>
         </w:numPr>
       </w:pPr>
       <w:r>
@@ -23087,15 +23504,15 @@
         <w:pStyle w:val="Compact"/>
         <w:numPr>
           <w:ilvl w:val="1"/>
-          <w:numId w:val="1035"/>
+          <w:numId w:val="1036"/>
         </w:numPr>
       </w:pPr>
       <w:r>
         <w:t xml:space="preserve">the push switch (off → inbox only; on → push).</w:t>
       </w:r>
     </w:p>
-    <w:bookmarkEnd w:id="76"/>
-    <w:bookmarkStart w:id="77" w:name="X80dbf1ebbd5ff6213545788a43f07e5df904cdf"/>
+    <w:bookmarkEnd w:id="77"/>
+    <w:bookmarkStart w:id="78" w:name="X80dbf1ebbd5ff6213545788a43f07e5df904cdf"/>
     <w:p>
       <w:pPr>
         <w:pStyle w:val="Heading4"/>
@@ -23488,9 +23905,9 @@
         </w:tc>
       </w:tr>
     </w:tbl>
-    <w:bookmarkEnd w:id="77"/>
     <w:bookmarkEnd w:id="78"/>
-    <w:bookmarkStart w:id="81" w:name="X5f7820578832f258d43ae5e0855f39a259de568"/>
+    <w:bookmarkEnd w:id="79"/>
+    <w:bookmarkStart w:id="82" w:name="X5f7820578832f258d43ae5e0855f39a259de568"/>
     <w:p>
       <w:pPr>
         <w:pStyle w:val="Heading3"/>
@@ -23499,7 +23916,7 @@
         <w:t xml:space="preserve">5.3 Log Inspection and Resource Monitoring</w:t>
       </w:r>
     </w:p>
-    <w:bookmarkStart w:id="79" w:name="Xd1868284c69ceaf44aa945c0b085e6367aaeb26"/>
+    <w:bookmarkStart w:id="80" w:name="Xd1868284c69ceaf44aa945c0b085e6367aaeb26"/>
     <w:p>
       <w:pPr>
         <w:pStyle w:val="Heading4"/>
@@ -23895,7 +24312,7 @@
         <w:pStyle w:val="Compact"/>
         <w:numPr>
           <w:ilvl w:val="0"/>
-          <w:numId w:val="1036"/>
+          <w:numId w:val="1037"/>
         </w:numPr>
       </w:pPr>
       <w:r>
@@ -23919,7 +24336,7 @@
         <w:pStyle w:val="Compact"/>
         <w:numPr>
           <w:ilvl w:val="0"/>
-          <w:numId w:val="1036"/>
+          <w:numId w:val="1037"/>
         </w:numPr>
       </w:pPr>
       <w:r>
@@ -23943,7 +24360,7 @@
         <w:pStyle w:val="Compact"/>
         <w:numPr>
           <w:ilvl w:val="0"/>
-          <w:numId w:val="1036"/>
+          <w:numId w:val="1037"/>
         </w:numPr>
       </w:pPr>
       <w:r>
@@ -23962,8 +24379,8 @@
         <w:t xml:space="preserve">.</w:t>
       </w:r>
     </w:p>
-    <w:bookmarkEnd w:id="79"/>
-    <w:bookmarkStart w:id="80" w:name="X1c49797686c5d8bcac10dc665b5e5bcfd5efe95"/>
+    <w:bookmarkEnd w:id="80"/>
+    <w:bookmarkStart w:id="81" w:name="X1c49797686c5d8bcac10dc665b5e5bcfd5efe95"/>
     <w:p>
       <w:pPr>
         <w:pStyle w:val="Heading4"/>
@@ -24382,9 +24799,9 @@
         </w:tc>
       </w:tr>
     </w:tbl>
-    <w:bookmarkEnd w:id="80"/>
     <w:bookmarkEnd w:id="81"/>
-    <w:bookmarkStart w:id="108" w:name="Xc3262cf2636d98ed9cb4fe33284ee128f646202"/>
+    <w:bookmarkEnd w:id="82"/>
+    <w:bookmarkStart w:id="109" w:name="Xc3262cf2636d98ed9cb4fe33284ee128f646202"/>
     <w:p>
       <w:pPr>
         <w:pStyle w:val="Heading3"/>
@@ -24401,7 +24818,7 @@
         <w:t xml:space="preserve">The terminal and web screenshots were taken on 2026-10-19 on the production server, with the version deployed that day at 03:20; the terminal ones show the real output of the commands. The Portainer ones (5.4.1) are from 2026-10-16, because the panel requires logging in and only the DevOps owner uses it.</w:t>
       </w:r>
     </w:p>
-    <w:bookmarkStart w:id="91" w:name="X819b6a502b2f0637e9f8fe3e2617ab6f5ae1350"/>
+    <w:bookmarkStart w:id="92" w:name="X819b6a502b2f0637e9f8fe3e2617ab6f5ae1350"/>
     <w:p>
       <w:pPr>
         <w:pStyle w:val="Heading4"/>
@@ -24419,18 +24836,18 @@
           <wp:inline>
             <wp:extent cx="5334000" cy="4000500"/>
             <wp:effectExtent b="0" l="0" r="0" t="0"/>
-            <wp:docPr descr="Portainer: containers of the lavarapido stack in Running" title="" id="83" name="Picture"/>
+            <wp:docPr descr="Portainer: containers of the lavarapido stack in Running" title="" id="84" name="Picture"/>
             <a:graphic>
               <a:graphicData uri="http://schemas.openxmlformats.org/drawingml/2006/picture">
                 <pic:pic>
                   <pic:nvPicPr>
-                    <pic:cNvPr descr="capturas/5.4.1-portainer-running.png" id="84" name="Picture"/>
+                    <pic:cNvPr descr="capturas/5.4.1-portainer-running.png" id="85" name="Picture"/>
                     <pic:cNvPicPr>
                       <a:picLocks noChangeArrowheads="1" noChangeAspect="1"/>
                     </pic:cNvPicPr>
                   </pic:nvPicPr>
                   <pic:blipFill>
-                    <a:blip r:embed="rId82"/>
+                    <a:blip r:embed="rId83"/>
                     <a:stretch>
                       <a:fillRect/>
                     </a:stretch>
@@ -24540,18 +24957,18 @@
           <wp:inline>
             <wp:extent cx="5334000" cy="4000500"/>
             <wp:effectExtent b="0" l="0" r="0" t="0"/>
-            <wp:docPr descr="Portainer: lavarapido stack" title="" id="86" name="Picture"/>
+            <wp:docPr descr="Portainer: lavarapido stack" title="" id="87" name="Picture"/>
             <a:graphic>
               <a:graphicData uri="http://schemas.openxmlformats.org/drawingml/2006/picture">
                 <pic:pic>
                   <pic:nvPicPr>
-                    <pic:cNvPr descr="capturas/5.4.1b-portainer-stack.png" id="87" name="Picture"/>
+                    <pic:cNvPr descr="capturas/5.4.1b-portainer-stack.png" id="88" name="Picture"/>
                     <pic:cNvPicPr>
                       <a:picLocks noChangeArrowheads="1" noChangeAspect="1"/>
                     </pic:cNvPicPr>
                   </pic:nvPicPr>
                   <pic:blipFill>
-                    <a:blip r:embed="rId85"/>
+                    <a:blip r:embed="rId86"/>
                     <a:stretch>
                       <a:fillRect/>
                     </a:stretch>
@@ -24587,18 +25004,18 @@
           <wp:inline>
             <wp:extent cx="5334000" cy="4155558"/>
             <wp:effectExtent b="0" l="0" r="0" t="0"/>
-            <wp:docPr descr="Container status and usage from the terminal" title="" id="89" name="Picture"/>
+            <wp:docPr descr="Container status and usage from the terminal" title="" id="90" name="Picture"/>
             <a:graphic>
               <a:graphicData uri="http://schemas.openxmlformats.org/drawingml/2006/picture">
                 <pic:pic>
                   <pic:nvPicPr>
-                    <pic:cNvPr descr="capturas/5.4.1c-contenedores-y-consumo.png" id="90" name="Picture"/>
+                    <pic:cNvPr descr="capturas/5.4.1c-contenedores-y-consumo.png" id="91" name="Picture"/>
                     <pic:cNvPicPr>
                       <a:picLocks noChangeArrowheads="1" noChangeAspect="1"/>
                     </pic:cNvPicPr>
                   </pic:nvPicPr>
                   <pic:blipFill>
-                    <a:blip r:embed="rId88"/>
+                    <a:blip r:embed="rId89"/>
                     <a:stretch>
                       <a:fillRect/>
                     </a:stretch>
@@ -24680,8 +25097,8 @@
         <w:t xml:space="preserve">, and the memory usage of each container.</w:t>
       </w:r>
     </w:p>
-    <w:bookmarkEnd w:id="91"/>
-    <w:bookmarkStart w:id="95" w:name="X8ec07d82068b8417d87ccdff071440257430501"/>
+    <w:bookmarkEnd w:id="92"/>
+    <w:bookmarkStart w:id="96" w:name="X8ec07d82068b8417d87ccdff071440257430501"/>
     <w:p>
       <w:pPr>
         <w:pStyle w:val="Heading4"/>
@@ -24699,18 +25116,18 @@
           <wp:inline>
             <wp:extent cx="5334000" cy="1848293"/>
             <wp:effectExtent b="0" l="0" r="0" t="0"/>
-            <wp:docPr descr="Startup logs of the services" title="" id="93" name="Picture"/>
+            <wp:docPr descr="Startup logs of the services" title="" id="94" name="Picture"/>
             <a:graphic>
               <a:graphicData uri="http://schemas.openxmlformats.org/drawingml/2006/picture">
                 <pic:pic>
                   <pic:nvPicPr>
-                    <pic:cNvPr descr="capturas/5.4.2-logs-backend.png" id="94" name="Picture"/>
+                    <pic:cNvPr descr="capturas/5.4.2-logs-backend.png" id="95" name="Picture"/>
                     <pic:cNvPicPr>
                       <a:picLocks noChangeArrowheads="1" noChangeAspect="1"/>
                     </pic:cNvPicPr>
                   </pic:nvPicPr>
                   <pic:blipFill>
-                    <a:blip r:embed="rId92"/>
+                    <a:blip r:embed="rId93"/>
                     <a:stretch>
                       <a:fillRect/>
                     </a:stretch>
@@ -24771,8 +25188,8 @@
         <w:t xml:space="preserve">Now listening on :3005*. There are 0 error traces in the last 15 minutes.*</w:t>
       </w:r>
     </w:p>
-    <w:bookmarkEnd w:id="95"/>
-    <w:bookmarkStart w:id="99" w:name="X8e6b636171d0b5d3cb5298d39180d176fd8cf7e"/>
+    <w:bookmarkEnd w:id="96"/>
+    <w:bookmarkStart w:id="100" w:name="X8e6b636171d0b5d3cb5298d39180d176fd8cf7e"/>
     <w:p>
       <w:pPr>
         <w:pStyle w:val="Heading4"/>
@@ -24790,18 +25207,18 @@
           <wp:inline>
             <wp:extent cx="5334000" cy="2031999"/>
             <wp:effectExtent b="0" l="0" r="0" t="0"/>
-            <wp:docPr descr="Health checks UP" title="" id="97" name="Picture"/>
+            <wp:docPr descr="Health checks UP" title="" id="98" name="Picture"/>
             <a:graphic>
               <a:graphicData uri="http://schemas.openxmlformats.org/drawingml/2006/picture">
                 <pic:pic>
                   <pic:nvPicPr>
-                    <pic:cNvPr descr="capturas/5.4.3-health-checks.png" id="98" name="Picture"/>
+                    <pic:cNvPr descr="capturas/5.4.3-health-checks.png" id="99" name="Picture"/>
                     <pic:cNvPicPr>
                       <a:picLocks noChangeArrowheads="1" noChangeAspect="1"/>
                     </pic:cNvPicPr>
                   </pic:nvPicPr>
                   <pic:blipFill>
-                    <a:blip r:embed="rId96"/>
+                    <a:blip r:embed="rId97"/>
                     <a:stretch>
                       <a:fillRect/>
                     </a:stretch>
@@ -24935,8 +25352,8 @@
         <w:t xml:space="preserve">answer 200, and HTTP redirects to HTTPS with 308.</w:t>
       </w:r>
     </w:p>
-    <w:bookmarkEnd w:id="99"/>
-    <w:bookmarkStart w:id="103" w:name="Xcabb5f954e63da49788a894d62fbd1395415abc"/>
+    <w:bookmarkEnd w:id="100"/>
+    <w:bookmarkStart w:id="104" w:name="Xcabb5f954e63da49788a894d62fbd1395415abc"/>
     <w:p>
       <w:pPr>
         <w:pStyle w:val="Heading4"/>
@@ -24954,18 +25371,18 @@
           <wp:inline>
             <wp:extent cx="5334000" cy="3276153"/>
             <wp:effectExtent b="0" l="0" r="0" t="0"/>
-            <wp:docPr descr="Web in production with the console without errors" title="" id="101" name="Picture"/>
+            <wp:docPr descr="Web in production with the console without errors" title="" id="102" name="Picture"/>
             <a:graphic>
               <a:graphicData uri="http://schemas.openxmlformats.org/drawingml/2006/picture">
                 <pic:pic>
                   <pic:nvPicPr>
-                    <pic:cNvPr descr="capturas/5.4.4-web-devtools.png" id="102" name="Picture"/>
+                    <pic:cNvPr descr="capturas/5.4.4-web-devtools.png" id="103" name="Picture"/>
                     <pic:cNvPicPr>
                       <a:picLocks noChangeArrowheads="1" noChangeAspect="1"/>
                     </pic:cNvPicPr>
                   </pic:nvPicPr>
                   <pic:blipFill>
-                    <a:blip r:embed="rId100"/>
+                    <a:blip r:embed="rId101"/>
                     <a:stretch>
                       <a:fillRect/>
                     </a:stretch>
@@ -25004,8 +25421,8 @@
         <w:t xml:space="preserve">Home page in production over HTTPS (TLS 1.3, Let's Encrypt certificate valid until 2027-01-14). On load: 0 errors and 0 warnings in the console, and 0 error responses.</w:t>
       </w:r>
     </w:p>
-    <w:bookmarkEnd w:id="103"/>
-    <w:bookmarkStart w:id="107" w:name="Xc9767a34b0d807ca3c437bd373c01ecd161759e"/>
+    <w:bookmarkEnd w:id="104"/>
+    <w:bookmarkStart w:id="108" w:name="Xc9767a34b0d807ca3c437bd373c01ecd161759e"/>
     <w:p>
       <w:pPr>
         <w:pStyle w:val="Heading4"/>
@@ -25023,18 +25440,18 @@
           <wp:inline>
             <wp:extent cx="5334000" cy="4523562"/>
             <wp:effectExtent b="0" l="0" r="0" t="0"/>
-            <wp:docPr descr="Liquibase changesets executed" title="" id="105" name="Picture"/>
+            <wp:docPr descr="Liquibase changesets executed" title="" id="106" name="Picture"/>
             <a:graphic>
               <a:graphicData uri="http://schemas.openxmlformats.org/drawingml/2006/picture">
                 <pic:pic>
                   <pic:nvPicPr>
-                    <pic:cNvPr descr="capturas/5.4.5-migraciones.png" id="106" name="Picture"/>
+                    <pic:cNvPr descr="capturas/5.4.5-migraciones.png" id="107" name="Picture"/>
                     <pic:cNvPicPr>
                       <a:picLocks noChangeArrowheads="1" noChangeAspect="1"/>
                     </pic:cNvPicPr>
                   </pic:nvPicPr>
                   <pic:blipFill>
-                    <a:blip r:embed="rId104"/>
+                    <a:blip r:embed="rId105"/>
                     <a:stretch>
                       <a:fillRect/>
                     </a:stretch>
@@ -25148,7 +25565,7 @@
         <w:pStyle w:val="Compact"/>
         <w:numPr>
           <w:ilvl w:val="0"/>
-          <w:numId w:val="1037"/>
+          <w:numId w:val="1038"/>
         </w:numPr>
       </w:pPr>
       <w:r>
@@ -25166,7 +25583,7 @@
         <w:pStyle w:val="Compact"/>
         <w:numPr>
           <w:ilvl w:val="0"/>
-          <w:numId w:val="1037"/>
+          <w:numId w:val="1038"/>
         </w:numPr>
       </w:pPr>
       <w:r>
@@ -25184,7 +25601,7 @@
         <w:pStyle w:val="Compact"/>
         <w:numPr>
           <w:ilvl w:val="0"/>
-          <w:numId w:val="1037"/>
+          <w:numId w:val="1038"/>
         </w:numPr>
       </w:pPr>
       <w:r>
@@ -25197,10 +25614,10 @@
         <w:t xml:space="preserve">: architecture (ADR), OpenAPI and events.</w:t>
       </w:r>
     </w:p>
-    <w:bookmarkEnd w:id="107"/>
     <w:bookmarkEnd w:id="108"/>
     <w:bookmarkEnd w:id="109"/>
     <w:bookmarkEnd w:id="110"/>
+    <w:bookmarkEnd w:id="111"/>
     <w:sectPr>
       <w:footnotePr>
         <w:numRestart w:val="eachSect"/>
@@ -25626,6 +26043,9 @@
     <w:abstractNumId w:val="991"/>
   </w:num>
   <w:num w:numId="1024">
+    <w:abstractNumId w:val="991"/>
+  </w:num>
+  <w:num w:numId="1025">
     <w:abstractNumId w:val="99411"/>
     <w:lvlOverride w:ilvl="0">
       <w:startOverride w:val="1"/>
@@ -25655,13 +26075,13 @@
       <w:startOverride w:val="1"/>
     </w:lvlOverride>
   </w:num>
-  <w:num w:numId="1025">
-    <w:abstractNumId w:val="991"/>
-  </w:num>
   <w:num w:numId="1026">
     <w:abstractNumId w:val="991"/>
   </w:num>
   <w:num w:numId="1027">
+    <w:abstractNumId w:val="991"/>
+  </w:num>
+  <w:num w:numId="1028">
     <w:abstractNumId w:val="99411"/>
     <w:lvlOverride w:ilvl="0">
       <w:startOverride w:val="1"/>
@@ -25691,41 +26111,11 @@
       <w:startOverride w:val="1"/>
     </w:lvlOverride>
   </w:num>
-  <w:num w:numId="1028">
-    <w:abstractNumId w:val="991"/>
-  </w:num>
   <w:num w:numId="1029">
     <w:abstractNumId w:val="991"/>
   </w:num>
   <w:num w:numId="1030">
-    <w:abstractNumId w:val="99411"/>
-    <w:lvlOverride w:ilvl="0">
-      <w:startOverride w:val="1"/>
-    </w:lvlOverride>
-    <w:lvlOverride w:ilvl="1">
-      <w:startOverride w:val="1"/>
-    </w:lvlOverride>
-    <w:lvlOverride w:ilvl="2">
-      <w:startOverride w:val="1"/>
-    </w:lvlOverride>
-    <w:lvlOverride w:ilvl="3">
-      <w:startOverride w:val="1"/>
-    </w:lvlOverride>
-    <w:lvlOverride w:ilvl="4">
-      <w:startOverride w:val="1"/>
-    </w:lvlOverride>
-    <w:lvlOverride w:ilvl="5">
-      <w:startOverride w:val="1"/>
-    </w:lvlOverride>
-    <w:lvlOverride w:ilvl="6">
-      <w:startOverride w:val="1"/>
-    </w:lvlOverride>
-    <w:lvlOverride w:ilvl="7">
-      <w:startOverride w:val="1"/>
-    </w:lvlOverride>
-    <w:lvlOverride w:ilvl="8">
-      <w:startOverride w:val="1"/>
-    </w:lvlOverride>
+    <w:abstractNumId w:val="991"/>
   </w:num>
   <w:num w:numId="1031">
     <w:abstractNumId w:val="99411"/>
@@ -25788,7 +26178,34 @@
     </w:lvlOverride>
   </w:num>
   <w:num w:numId="1033">
-    <w:abstractNumId w:val="991"/>
+    <w:abstractNumId w:val="99411"/>
+    <w:lvlOverride w:ilvl="0">
+      <w:startOverride w:val="1"/>
+    </w:lvlOverride>
+    <w:lvlOverride w:ilvl="1">
+      <w:startOverride w:val="1"/>
+    </w:lvlOverride>
+    <w:lvlOverride w:ilvl="2">
+      <w:startOverride w:val="1"/>
+    </w:lvlOverride>
+    <w:lvlOverride w:ilvl="3">
+      <w:startOverride w:val="1"/>
+    </w:lvlOverride>
+    <w:lvlOverride w:ilvl="4">
+      <w:startOverride w:val="1"/>
+    </w:lvlOverride>
+    <w:lvlOverride w:ilvl="5">
+      <w:startOverride w:val="1"/>
+    </w:lvlOverride>
+    <w:lvlOverride w:ilvl="6">
+      <w:startOverride w:val="1"/>
+    </w:lvlOverride>
+    <w:lvlOverride w:ilvl="7">
+      <w:startOverride w:val="1"/>
+    </w:lvlOverride>
+    <w:lvlOverride w:ilvl="8">
+      <w:startOverride w:val="1"/>
+    </w:lvlOverride>
   </w:num>
   <w:num w:numId="1034">
     <w:abstractNumId w:val="991"/>
@@ -25800,6 +26217,9 @@
     <w:abstractNumId w:val="991"/>
   </w:num>
   <w:num w:numId="1037">
+    <w:abstractNumId w:val="991"/>
+  </w:num>
+  <w:num w:numId="1038">
     <w:abstractNumId w:val="991"/>
   </w:num>
 </w:numbering>

</xml_diff>